<commit_message>
Updated files, removed obsolete init_db.py and metadata1.csv
</commit_message>
<xml_diff>
--- a/Docs/YouTube_automation-Steps.docx
+++ b/Docs/YouTube_automation-Steps.docx
@@ -206,7 +206,7 @@
     <w:p>
       <w:r>
         <w:pict>
-          <v:rect id="_x0000_i1029" style="width:0;height:1.5pt" o:hralign="center" o:hrstd="t" o:hr="t" fillcolor="#a0a0a0" stroked="f"/>
+          <v:rect id="_x0000_i1025" style="width:0;height:1.5pt" o:hralign="center" o:hrstd="t" o:hr="t" fillcolor="#a0a0a0" stroked="f"/>
         </w:pict>
       </w:r>
     </w:p>
@@ -461,7 +461,7 @@
     <w:p>
       <w:r>
         <w:pict>
-          <v:rect id="_x0000_i1030" style="width:0;height:1.5pt" o:hralign="center" o:hrstd="t" o:hr="t" fillcolor="#a0a0a0" stroked="f"/>
+          <v:rect id="_x0000_i1026" style="width:0;height:1.5pt" o:hralign="center" o:hrstd="t" o:hr="t" fillcolor="#a0a0a0" stroked="f"/>
         </w:pict>
       </w:r>
     </w:p>
@@ -778,7 +778,7 @@
     <w:p>
       <w:r>
         <w:pict>
-          <v:rect id="_x0000_i1031" style="width:0;height:1.5pt" o:hralign="center" o:hrstd="t" o:hr="t" fillcolor="#a0a0a0" stroked="f"/>
+          <v:rect id="_x0000_i1027" style="width:0;height:1.5pt" o:hralign="center" o:hrstd="t" o:hr="t" fillcolor="#a0a0a0" stroked="f"/>
         </w:pict>
       </w:r>
     </w:p>
@@ -882,7 +882,7 @@
     <w:p>
       <w:r>
         <w:pict>
-          <v:rect id="_x0000_i1032" style="width:0;height:1.5pt" o:hralign="center" o:hrstd="t" o:hr="t" fillcolor="#a0a0a0" stroked="f"/>
+          <v:rect id="_x0000_i1028" style="width:0;height:1.5pt" o:hralign="center" o:hrstd="t" o:hr="t" fillcolor="#a0a0a0" stroked="f"/>
         </w:pict>
       </w:r>
     </w:p>
@@ -1287,7 +1287,7 @@
       </w:pPr>
       <w:r>
         <w:pict>
-          <v:rect id="_x0000_i1033" style="width:0;height:1.5pt" o:hralign="center" o:hrstd="t" o:hr="t" fillcolor="#a0a0a0" stroked="f"/>
+          <v:rect id="_x0000_i1029" style="width:0;height:1.5pt" o:hralign="center" o:hrstd="t" o:hr="t" fillcolor="#a0a0a0" stroked="f"/>
         </w:pict>
       </w:r>
     </w:p>
@@ -1484,6 +1484,9 @@
           <w:ilvl w:val="0"/>
           <w:numId w:val="5"/>
         </w:numPr>
+        <w:pBdr>
+          <w:bottom w:val="double" w:sz="6" w:space="1" w:color="auto"/>
+        </w:pBdr>
       </w:pPr>
       <w:r>
         <w:rPr>
@@ -1515,7 +1518,1727 @@
         <w:t>, your first video will schedule itself automatically via GitHub Actions.</w:t>
       </w:r>
     </w:p>
-    <w:p>
+    <w:p/>
+    <w:p>
+      <w:pPr>
+        <w:pStyle w:val="Heading2"/>
+      </w:pPr>
+      <w:r>
+        <w:t>Project: Autonomous Content Delivery Pipeline</w:t>
+      </w:r>
+    </w:p>
+    <w:p>
+      <w:pPr>
+        <w:pStyle w:val="NormalWeb"/>
+      </w:pPr>
+      <w:r>
+        <w:rPr>
+          <w:b/>
+          <w:bCs/>
+        </w:rPr>
+        <w:t>Core Goal:</w:t>
+      </w:r>
+      <w:r>
+        <w:t xml:space="preserve"> To fully automate the journey of a video file from a local computer to a live YouTube channel with zero manual work.</w:t>
+      </w:r>
+    </w:p>
+    <w:p>
+      <w:r>
+        <w:pict>
+          <v:rect id="_x0000_i1030" style="width:0;height:1.5pt" o:hralign="center" o:hrstd="t" o:hr="t" fillcolor="#a0a0a0" stroked="f"/>
+        </w:pict>
+      </w:r>
+    </w:p>
+    <w:p>
+      <w:pPr>
+        <w:pStyle w:val="Heading3"/>
+      </w:pPr>
+      <w:r>
+        <w:lastRenderedPageBreak/>
+        <w:t>Phase 1: Automatic Detection (</w:t>
+      </w:r>
+      <w:r>
+        <w:rPr>
+          <w:rStyle w:val="HTMLCode"/>
+          <w:rFonts w:eastAsiaTheme="majorEastAsia"/>
+        </w:rPr>
+        <w:t>watcher.py</w:t>
+      </w:r>
+      <w:r>
+        <w:t>)</w:t>
+      </w:r>
+    </w:p>
+    <w:p>
+      <w:pPr>
+        <w:pStyle w:val="NormalWeb"/>
+        <w:numPr>
+          <w:ilvl w:val="0"/>
+          <w:numId w:val="11"/>
+        </w:numPr>
+      </w:pPr>
+      <w:r>
+        <w:rPr>
+          <w:b/>
+          <w:bCs/>
+        </w:rPr>
+        <w:t>The Goal:</w:t>
+      </w:r>
+      <w:r>
+        <w:t xml:space="preserve"> Make the system "smart" so it knows exactly when a new video is ready for processing.</w:t>
+      </w:r>
+    </w:p>
+    <w:p>
+      <w:pPr>
+        <w:pStyle w:val="NormalWeb"/>
+        <w:numPr>
+          <w:ilvl w:val="0"/>
+          <w:numId w:val="11"/>
+        </w:numPr>
+      </w:pPr>
+      <w:r>
+        <w:rPr>
+          <w:b/>
+          <w:bCs/>
+        </w:rPr>
+        <w:t>The Work:</w:t>
+      </w:r>
+      <w:r>
+        <w:t xml:space="preserve"> Developed a background listener that detects new files the instant they are saved into a specific folder.</w:t>
+      </w:r>
+    </w:p>
+    <w:p>
+      <w:pPr>
+        <w:pStyle w:val="NormalWeb"/>
+        <w:numPr>
+          <w:ilvl w:val="0"/>
+          <w:numId w:val="11"/>
+        </w:numPr>
+      </w:pPr>
+      <w:r>
+        <w:rPr>
+          <w:b/>
+          <w:bCs/>
+        </w:rPr>
+        <w:t>The Benefit:</w:t>
+      </w:r>
+      <w:r>
+        <w:t xml:space="preserve"> It automatically triggers a popup window to collect the </w:t>
+      </w:r>
+      <w:r>
+        <w:rPr>
+          <w:b/>
+          <w:bCs/>
+        </w:rPr>
+        <w:t>Title</w:t>
+      </w:r>
+      <w:r>
+        <w:t xml:space="preserve"> and </w:t>
+      </w:r>
+      <w:r>
+        <w:rPr>
+          <w:b/>
+          <w:bCs/>
+        </w:rPr>
+        <w:t>Description</w:t>
+      </w:r>
+      <w:r>
+        <w:t>, ensuring every video is captured with high-quality metadata from the very start.</w:t>
+      </w:r>
+    </w:p>
+    <w:p>
+      <w:pPr>
+        <w:pStyle w:val="Heading3"/>
+      </w:pPr>
+      <w:r>
+        <w:t>Phase 2: Database Organization (</w:t>
+      </w:r>
+      <w:r>
+        <w:rPr>
+          <w:rStyle w:val="HTMLCode"/>
+          <w:rFonts w:eastAsiaTheme="majorEastAsia"/>
+        </w:rPr>
+        <w:t>init_db.py</w:t>
+      </w:r>
+      <w:r>
+        <w:t>)</w:t>
+      </w:r>
+    </w:p>
+    <w:p>
+      <w:pPr>
+        <w:pStyle w:val="NormalWeb"/>
+        <w:numPr>
+          <w:ilvl w:val="0"/>
+          <w:numId w:val="12"/>
+        </w:numPr>
+      </w:pPr>
+      <w:r>
+        <w:rPr>
+          <w:b/>
+          <w:bCs/>
+        </w:rPr>
+        <w:t>The Goal:</w:t>
+      </w:r>
+      <w:r>
+        <w:t xml:space="preserve"> Keep thousands of records perfectly organized and searchable.</w:t>
+      </w:r>
+    </w:p>
+    <w:p>
+      <w:pPr>
+        <w:pStyle w:val="NormalWeb"/>
+        <w:numPr>
+          <w:ilvl w:val="0"/>
+          <w:numId w:val="12"/>
+        </w:numPr>
+      </w:pPr>
+      <w:r>
+        <w:rPr>
+          <w:b/>
+          <w:bCs/>
+        </w:rPr>
+        <w:t>The Work:</w:t>
+      </w:r>
+      <w:r>
+        <w:t xml:space="preserve"> Created a synchronization engine that links a local </w:t>
+      </w:r>
+      <w:r>
+        <w:rPr>
+          <w:b/>
+          <w:bCs/>
+        </w:rPr>
+        <w:t>SQLite database</w:t>
+      </w:r>
+      <w:r>
+        <w:t xml:space="preserve"> with a master </w:t>
+      </w:r>
+      <w:r>
+        <w:rPr>
+          <w:b/>
+          <w:bCs/>
+        </w:rPr>
+        <w:t>CSV file</w:t>
+      </w:r>
+      <w:r>
+        <w:t>.</w:t>
+      </w:r>
+    </w:p>
+    <w:p>
+      <w:pPr>
+        <w:pStyle w:val="NormalWeb"/>
+        <w:numPr>
+          <w:ilvl w:val="0"/>
+          <w:numId w:val="12"/>
+        </w:numPr>
+      </w:pPr>
+      <w:r>
+        <w:rPr>
+          <w:b/>
+          <w:bCs/>
+        </w:rPr>
+        <w:t>The Benefit:</w:t>
+      </w:r>
+      <w:r>
+        <w:t xml:space="preserve"> It serves as a "Source of Truth," preventing duplicate uploads and ensuring that your physical files always match your digital records.</w:t>
+      </w:r>
+    </w:p>
+    <w:p>
+      <w:pPr>
+        <w:pStyle w:val="Heading3"/>
+      </w:pPr>
+      <w:r>
+        <w:t>Phase 3: Smart Cloud Upload (</w:t>
+      </w:r>
+      <w:r>
+        <w:rPr>
+          <w:rStyle w:val="HTMLCode"/>
+          <w:rFonts w:eastAsiaTheme="majorEastAsia"/>
+        </w:rPr>
+        <w:t>feeder.py</w:t>
+      </w:r>
+      <w:r>
+        <w:t>)</w:t>
+      </w:r>
+    </w:p>
+    <w:p>
+      <w:pPr>
+        <w:pStyle w:val="NormalWeb"/>
+        <w:numPr>
+          <w:ilvl w:val="0"/>
+          <w:numId w:val="13"/>
+        </w:numPr>
+      </w:pPr>
+      <w:r>
+        <w:rPr>
+          <w:b/>
+          <w:bCs/>
+        </w:rPr>
+        <w:t>The Goal:</w:t>
+      </w:r>
+      <w:r>
+        <w:t xml:space="preserve"> Securely move large video assets to the cloud while saving local disk space.</w:t>
+      </w:r>
+    </w:p>
+    <w:p>
+      <w:pPr>
+        <w:pStyle w:val="NormalWeb"/>
+        <w:numPr>
+          <w:ilvl w:val="0"/>
+          <w:numId w:val="13"/>
+        </w:numPr>
+      </w:pPr>
+      <w:r>
+        <w:rPr>
+          <w:b/>
+          <w:bCs/>
+        </w:rPr>
+        <w:t>The Work:</w:t>
+      </w:r>
+      <w:r>
+        <w:t xml:space="preserve"> Engineered a "Transporter" script using the </w:t>
+      </w:r>
+      <w:r>
+        <w:rPr>
+          <w:b/>
+          <w:bCs/>
+        </w:rPr>
+        <w:t>Google Drive API</w:t>
+      </w:r>
+      <w:r>
+        <w:t xml:space="preserve"> with </w:t>
+      </w:r>
+      <w:proofErr w:type="spellStart"/>
+      <w:r>
+        <w:t>resumable</w:t>
+      </w:r>
+      <w:proofErr w:type="spellEnd"/>
+      <w:r>
+        <w:t xml:space="preserve"> upload logic.</w:t>
+      </w:r>
+    </w:p>
+    <w:p>
+      <w:pPr>
+        <w:pStyle w:val="NormalWeb"/>
+        <w:numPr>
+          <w:ilvl w:val="0"/>
+          <w:numId w:val="13"/>
+        </w:numPr>
+      </w:pPr>
+      <w:r>
+        <w:rPr>
+          <w:b/>
+          <w:bCs/>
+        </w:rPr>
+        <w:t>The Benefit:</w:t>
+      </w:r>
+      <w:r>
+        <w:t xml:space="preserve"> Once a video is safe in the cloud, the system automatically deletes the local copy to free up storage. It also handles internet interruptions by picking up exactly where it left off.</w:t>
+      </w:r>
+    </w:p>
+    <w:p>
+      <w:pPr>
+        <w:pStyle w:val="Heading3"/>
+      </w:pPr>
+      <w:r>
+        <w:t>Phase 4: Remote Tracking (</w:t>
+      </w:r>
+      <w:r>
+        <w:rPr>
+          <w:rStyle w:val="HTMLCode"/>
+          <w:rFonts w:eastAsiaTheme="majorEastAsia"/>
+        </w:rPr>
+        <w:t>cloud_sync_init.py</w:t>
+      </w:r>
+      <w:r>
+        <w:t>)</w:t>
+      </w:r>
+    </w:p>
+    <w:p>
+      <w:pPr>
+        <w:pStyle w:val="NormalWeb"/>
+        <w:numPr>
+          <w:ilvl w:val="0"/>
+          <w:numId w:val="14"/>
+        </w:numPr>
+      </w:pPr>
+      <w:r>
+        <w:rPr>
+          <w:b/>
+          <w:bCs/>
+        </w:rPr>
+        <w:t>The Goal:</w:t>
+      </w:r>
+      <w:r>
+        <w:t xml:space="preserve"> Monitor the entire pipeline's health from any location.</w:t>
+      </w:r>
+    </w:p>
+    <w:p>
+      <w:pPr>
+        <w:pStyle w:val="NormalWeb"/>
+        <w:numPr>
+          <w:ilvl w:val="0"/>
+          <w:numId w:val="14"/>
+        </w:numPr>
+      </w:pPr>
+      <w:r>
+        <w:rPr>
+          <w:b/>
+          <w:bCs/>
+        </w:rPr>
+        <w:t>The Work:</w:t>
+      </w:r>
+      <w:r>
+        <w:t xml:space="preserve"> Integrated the local database with the </w:t>
+      </w:r>
+      <w:r>
+        <w:rPr>
+          <w:b/>
+          <w:bCs/>
+        </w:rPr>
+        <w:t>Google Sheets API</w:t>
+      </w:r>
+      <w:r>
+        <w:t xml:space="preserve"> for real-time mirroring.</w:t>
+      </w:r>
+    </w:p>
+    <w:p>
+      <w:pPr>
+        <w:pStyle w:val="NormalWeb"/>
+        <w:numPr>
+          <w:ilvl w:val="0"/>
+          <w:numId w:val="14"/>
+        </w:numPr>
+      </w:pPr>
+      <w:r>
+        <w:rPr>
+          <w:b/>
+          <w:bCs/>
+        </w:rPr>
+        <w:t>The Benefit:</w:t>
+      </w:r>
+      <w:r>
+        <w:t xml:space="preserve"> You can track every upload's status (Pending, Uploaded, or Published) directly from a mobile phone or laptop without needing access to the main server.</w:t>
+      </w:r>
+    </w:p>
+    <w:p>
+      <w:pPr>
+        <w:pStyle w:val="Heading3"/>
+      </w:pPr>
+      <w:r>
+        <w:t>Phase 5: Final Publishing (</w:t>
+      </w:r>
+      <w:r>
+        <w:rPr>
+          <w:rStyle w:val="HTMLCode"/>
+          <w:rFonts w:eastAsiaTheme="majorEastAsia"/>
+        </w:rPr>
+        <w:t>uploader.py</w:t>
+      </w:r>
+      <w:r>
+        <w:t>)</w:t>
+      </w:r>
+    </w:p>
+    <w:p>
+      <w:pPr>
+        <w:pStyle w:val="NormalWeb"/>
+        <w:numPr>
+          <w:ilvl w:val="0"/>
+          <w:numId w:val="15"/>
+        </w:numPr>
+      </w:pPr>
+      <w:r>
+        <w:rPr>
+          <w:b/>
+          <w:bCs/>
+        </w:rPr>
+        <w:t>The Goal:</w:t>
+      </w:r>
+      <w:r>
+        <w:t xml:space="preserve"> Deliver the content to the global audience with zero manual intervention.</w:t>
+      </w:r>
+    </w:p>
+    <w:p>
+      <w:pPr>
+        <w:pStyle w:val="NormalWeb"/>
+        <w:numPr>
+          <w:ilvl w:val="0"/>
+          <w:numId w:val="15"/>
+        </w:numPr>
+      </w:pPr>
+      <w:r>
+        <w:rPr>
+          <w:b/>
+          <w:bCs/>
+        </w:rPr>
+        <w:t>The Work:</w:t>
+      </w:r>
+      <w:r>
+        <w:t xml:space="preserve"> Built a publishing terminal using the </w:t>
+      </w:r>
+      <w:r>
+        <w:rPr>
+          <w:b/>
+          <w:bCs/>
+        </w:rPr>
+        <w:t>YouTube Data API v3</w:t>
+      </w:r>
+      <w:r>
+        <w:t xml:space="preserve"> to push metadata and video files.</w:t>
+      </w:r>
+    </w:p>
+    <w:p>
+      <w:pPr>
+        <w:pStyle w:val="NormalWeb"/>
+        <w:numPr>
+          <w:ilvl w:val="0"/>
+          <w:numId w:val="15"/>
+        </w:numPr>
+      </w:pPr>
+      <w:r>
+        <w:rPr>
+          <w:b/>
+          <w:bCs/>
+        </w:rPr>
+        <w:t>The Benefit:</w:t>
+      </w:r>
+      <w:r>
+        <w:t xml:space="preserve"> The script handles the final post, updates the database with the live YouTube URL, and officially closes the task in the master records.</w:t>
+      </w:r>
+    </w:p>
+    <w:p>
+      <w:pPr>
+        <w:pStyle w:val="Heading3"/>
+      </w:pPr>
+      <w:r>
+        <w:t>Phase 6: Management Dashboard (</w:t>
+      </w:r>
+      <w:r>
+        <w:rPr>
+          <w:rStyle w:val="HTMLCode"/>
+          <w:rFonts w:eastAsiaTheme="majorEastAsia"/>
+        </w:rPr>
+        <w:t>app.py</w:t>
+      </w:r>
+      <w:r>
+        <w:t>)</w:t>
+      </w:r>
+    </w:p>
+    <w:p>
+      <w:pPr>
+        <w:pStyle w:val="NormalWeb"/>
+        <w:numPr>
+          <w:ilvl w:val="0"/>
+          <w:numId w:val="16"/>
+        </w:numPr>
+      </w:pPr>
+      <w:r>
+        <w:rPr>
+          <w:b/>
+          <w:bCs/>
+        </w:rPr>
+        <w:t>The Goal:</w:t>
+      </w:r>
+      <w:r>
+        <w:t xml:space="preserve"> Provide a centralized "Control Tower" for the user.</w:t>
+      </w:r>
+    </w:p>
+    <w:p>
+      <w:pPr>
+        <w:pStyle w:val="NormalWeb"/>
+        <w:numPr>
+          <w:ilvl w:val="0"/>
+          <w:numId w:val="16"/>
+        </w:numPr>
+      </w:pPr>
+      <w:r>
+        <w:rPr>
+          <w:b/>
+          <w:bCs/>
+        </w:rPr>
+        <w:t>The Work:</w:t>
+      </w:r>
+      <w:r>
+        <w:t xml:space="preserve"> Developed a web-based dashboard using </w:t>
+      </w:r>
+      <w:proofErr w:type="spellStart"/>
+      <w:r>
+        <w:rPr>
+          <w:b/>
+          <w:bCs/>
+        </w:rPr>
+        <w:t>Streamlit</w:t>
+      </w:r>
+      <w:proofErr w:type="spellEnd"/>
+      <w:r>
+        <w:t xml:space="preserve"> to visualize the pipeline's progress.</w:t>
+      </w:r>
+    </w:p>
+    <w:p>
+      <w:pPr>
+        <w:pStyle w:val="NormalWeb"/>
+        <w:numPr>
+          <w:ilvl w:val="0"/>
+          <w:numId w:val="16"/>
+        </w:numPr>
+      </w:pPr>
+      <w:r>
+        <w:rPr>
+          <w:b/>
+          <w:bCs/>
+        </w:rPr>
+        <w:lastRenderedPageBreak/>
+        <w:t>The Benefit:</w:t>
+      </w:r>
+      <w:r>
+        <w:t xml:space="preserve"> It allows you to oversee the entire operation, manually override tasks if needed, and edit video data through a clean, professional interface instead of raw code.</w:t>
+      </w:r>
+    </w:p>
+    <w:p>
+      <w:r>
+        <w:pict>
+          <v:rect id="_x0000_i1031" style="width:0;height:1.5pt" o:hralign="center" o:hrstd="t" o:hr="t" fillcolor="#a0a0a0" stroked="f"/>
+        </w:pict>
+      </w:r>
+    </w:p>
+    <w:p>
+      <w:pPr>
+        <w:pStyle w:val="Heading3"/>
+      </w:pPr>
+      <w:r>
+        <w:t>The "Recruiter" Summary</w:t>
+      </w:r>
+    </w:p>
+    <w:p>
+      <w:pPr>
+        <w:pStyle w:val="NormalWeb"/>
+      </w:pPr>
+      <w:r>
+        <w:t xml:space="preserve">"I built an end-to-end automation pipeline that handles the entire video publishing lifecycle. By integrating </w:t>
+      </w:r>
+      <w:r>
+        <w:rPr>
+          <w:b/>
+          <w:bCs/>
+        </w:rPr>
+        <w:t>Python with Cloud APIs</w:t>
+      </w:r>
+      <w:r>
+        <w:t xml:space="preserve">, I reduced manual work by </w:t>
+      </w:r>
+      <w:r>
+        <w:rPr>
+          <w:b/>
+          <w:bCs/>
+        </w:rPr>
+        <w:t>90%</w:t>
+      </w:r>
+      <w:r>
+        <w:t xml:space="preserve"> and ensured that data stays consistent across local storage, cloud databases, and global social media platforms."</w:t>
+      </w:r>
+    </w:p>
+    <w:p/>
+    <w:p/>
+    <w:p/>
+    <w:p>
+      <w:pPr>
+        <w:pBdr>
+          <w:bottom w:val="double" w:sz="6" w:space="1" w:color="auto"/>
+        </w:pBdr>
+      </w:pPr>
+    </w:p>
+    <w:p>
+      <w:pPr>
+        <w:pStyle w:val="Heading2"/>
+      </w:pPr>
+      <w:r>
+        <w:t>Project: Autonomous Content Delivery Pipeline</w:t>
+      </w:r>
+    </w:p>
+    <w:p>
+      <w:pPr>
+        <w:pStyle w:val="NormalWeb"/>
+      </w:pPr>
+      <w:r>
+        <w:rPr>
+          <w:b/>
+          <w:bCs/>
+        </w:rPr>
+        <w:t>Core Goal:</w:t>
+      </w:r>
+      <w:r>
+        <w:t xml:space="preserve"> To fully automate the journey of a video file from a local computer to a live YouTube channel with zero manual work.</w:t>
+      </w:r>
+    </w:p>
+    <w:p>
+      <w:pPr>
+        <w:pStyle w:val="Heading3"/>
+      </w:pPr>
+      <w:r>
+        <w:t>Phase 1: Automatic Detection (</w:t>
+      </w:r>
+      <w:r>
+        <w:rPr>
+          <w:rStyle w:val="HTMLCode"/>
+          <w:rFonts w:eastAsiaTheme="majorEastAsia"/>
+        </w:rPr>
+        <w:t>watcher.py</w:t>
+      </w:r>
+      <w:r>
+        <w:t>)</w:t>
+      </w:r>
+    </w:p>
+    <w:p>
+      <w:pPr>
+        <w:pStyle w:val="NormalWeb"/>
+        <w:numPr>
+          <w:ilvl w:val="0"/>
+          <w:numId w:val="17"/>
+        </w:numPr>
+      </w:pPr>
+      <w:r>
+        <w:rPr>
+          <w:b/>
+          <w:bCs/>
+        </w:rPr>
+        <w:t>The Goal:</w:t>
+      </w:r>
+      <w:r>
+        <w:t xml:space="preserve"> Make the system "smart" so it knows exactly when a new video is ready.</w:t>
+      </w:r>
+    </w:p>
+    <w:p>
+      <w:pPr>
+        <w:pStyle w:val="NormalWeb"/>
+        <w:numPr>
+          <w:ilvl w:val="0"/>
+          <w:numId w:val="17"/>
+        </w:numPr>
+      </w:pPr>
+      <w:r>
+        <w:rPr>
+          <w:b/>
+          <w:bCs/>
+        </w:rPr>
+        <w:t>The Work:</w:t>
+      </w:r>
+      <w:r>
+        <w:t xml:space="preserve"> A background listener detects new files in the </w:t>
+      </w:r>
+      <w:r>
+        <w:rPr>
+          <w:rStyle w:val="HTMLCode"/>
+        </w:rPr>
+        <w:t>videos/</w:t>
+      </w:r>
+      <w:r>
+        <w:t xml:space="preserve"> folder.</w:t>
+      </w:r>
+    </w:p>
+    <w:p>
+      <w:pPr>
+        <w:pStyle w:val="NormalWeb"/>
+        <w:numPr>
+          <w:ilvl w:val="0"/>
+          <w:numId w:val="17"/>
+        </w:numPr>
+      </w:pPr>
+      <w:r>
+        <w:rPr>
+          <w:b/>
+          <w:bCs/>
+        </w:rPr>
+        <w:t>The Benefit:</w:t>
+      </w:r>
+      <w:r>
+        <w:t xml:space="preserve"> It triggers a popup for metadata and marks the video as </w:t>
+      </w:r>
+      <w:r>
+        <w:rPr>
+          <w:b/>
+          <w:bCs/>
+        </w:rPr>
+        <w:t>'pending'</w:t>
+      </w:r>
+      <w:r>
+        <w:t>.</w:t>
+      </w:r>
+    </w:p>
+    <w:p>
+      <w:pPr>
+        <w:pStyle w:val="Heading3"/>
+      </w:pPr>
+      <w:r>
+        <w:t>Phase 2: Database Organization (</w:t>
+      </w:r>
+      <w:r>
+        <w:rPr>
+          <w:rStyle w:val="HTMLCode"/>
+          <w:rFonts w:eastAsiaTheme="majorEastAsia"/>
+        </w:rPr>
+        <w:t>init_db.py</w:t>
+      </w:r>
+      <w:r>
+        <w:t>)</w:t>
+      </w:r>
+    </w:p>
+    <w:p>
+      <w:pPr>
+        <w:pStyle w:val="NormalWeb"/>
+        <w:numPr>
+          <w:ilvl w:val="0"/>
+          <w:numId w:val="18"/>
+        </w:numPr>
+      </w:pPr>
+      <w:r>
+        <w:rPr>
+          <w:b/>
+          <w:bCs/>
+        </w:rPr>
+        <w:t>The Goal:</w:t>
+      </w:r>
+      <w:r>
+        <w:t xml:space="preserve"> Keep records perfectly organized.</w:t>
+      </w:r>
+    </w:p>
+    <w:p>
+      <w:pPr>
+        <w:pStyle w:val="NormalWeb"/>
+        <w:numPr>
+          <w:ilvl w:val="0"/>
+          <w:numId w:val="18"/>
+        </w:numPr>
+      </w:pPr>
+      <w:r>
+        <w:rPr>
+          <w:b/>
+          <w:bCs/>
+        </w:rPr>
+        <w:t>The Work:</w:t>
+      </w:r>
+      <w:r>
+        <w:t xml:space="preserve"> Syncs the local </w:t>
+      </w:r>
+      <w:r>
+        <w:rPr>
+          <w:b/>
+          <w:bCs/>
+        </w:rPr>
+        <w:t>SQLite database</w:t>
+      </w:r>
+      <w:r>
+        <w:t xml:space="preserve"> with your master </w:t>
+      </w:r>
+      <w:r>
+        <w:rPr>
+          <w:b/>
+          <w:bCs/>
+        </w:rPr>
+        <w:t>CSV</w:t>
+      </w:r>
+      <w:r>
+        <w:t>.</w:t>
+      </w:r>
+    </w:p>
+    <w:p>
+      <w:pPr>
+        <w:pStyle w:val="NormalWeb"/>
+        <w:numPr>
+          <w:ilvl w:val="0"/>
+          <w:numId w:val="18"/>
+        </w:numPr>
+      </w:pPr>
+      <w:r>
+        <w:rPr>
+          <w:b/>
+          <w:bCs/>
+        </w:rPr>
+        <w:t>The Benefit:</w:t>
+      </w:r>
+      <w:r>
+        <w:t xml:space="preserve"> It acts as the "Source of Truth," making sure your database and your files are always in sync.</w:t>
+      </w:r>
+    </w:p>
+    <w:p>
+      <w:pPr>
+        <w:pStyle w:val="Heading3"/>
+      </w:pPr>
+      <w:r>
+        <w:t>Phase 3: Smart Cloud Upload &amp; File Relocation (</w:t>
+      </w:r>
+      <w:r>
+        <w:rPr>
+          <w:rStyle w:val="HTMLCode"/>
+          <w:rFonts w:eastAsiaTheme="majorEastAsia"/>
+        </w:rPr>
+        <w:t>feeder.py</w:t>
+      </w:r>
+      <w:r>
+        <w:t>)</w:t>
+      </w:r>
+    </w:p>
+    <w:p>
+      <w:pPr>
+        <w:pStyle w:val="NormalWeb"/>
+        <w:numPr>
+          <w:ilvl w:val="0"/>
+          <w:numId w:val="19"/>
+        </w:numPr>
+      </w:pPr>
+      <w:r>
+        <w:rPr>
+          <w:b/>
+          <w:bCs/>
+        </w:rPr>
+        <w:t>The Goal:</w:t>
+      </w:r>
+      <w:r>
+        <w:t xml:space="preserve"> Secure the video in the cloud and clean up local storage.</w:t>
+      </w:r>
+    </w:p>
+    <w:p>
+      <w:pPr>
+        <w:pStyle w:val="NormalWeb"/>
+        <w:numPr>
+          <w:ilvl w:val="0"/>
+          <w:numId w:val="19"/>
+        </w:numPr>
+      </w:pPr>
+      <w:r>
+        <w:rPr>
+          <w:b/>
+          <w:bCs/>
+        </w:rPr>
+        <w:t>The Work:</w:t>
+      </w:r>
+      <w:r>
+        <w:t xml:space="preserve"> Moves the file to </w:t>
+      </w:r>
+      <w:r>
+        <w:rPr>
+          <w:b/>
+          <w:bCs/>
+        </w:rPr>
+        <w:t>Google Drive</w:t>
+      </w:r>
+      <w:r>
+        <w:t xml:space="preserve"> using </w:t>
+      </w:r>
+      <w:proofErr w:type="spellStart"/>
+      <w:r>
+        <w:t>resumable</w:t>
+      </w:r>
+      <w:proofErr w:type="spellEnd"/>
+      <w:r>
+        <w:t xml:space="preserve"> upload logic.</w:t>
+      </w:r>
+    </w:p>
+    <w:p>
+      <w:pPr>
+        <w:pStyle w:val="NormalWeb"/>
+        <w:numPr>
+          <w:ilvl w:val="0"/>
+          <w:numId w:val="19"/>
+        </w:numPr>
+      </w:pPr>
+      <w:r>
+        <w:rPr>
+          <w:b/>
+          <w:bCs/>
+        </w:rPr>
+        <w:t>The File Movement:</w:t>
+      </w:r>
+      <w:r>
+        <w:t xml:space="preserve"> Once the upload is confirmed, the script physically moves the video from </w:t>
+      </w:r>
+      <w:r>
+        <w:rPr>
+          <w:rStyle w:val="HTMLCode"/>
+        </w:rPr>
+        <w:t>videos/</w:t>
+      </w:r>
+      <w:r>
+        <w:t xml:space="preserve"> to the </w:t>
+      </w:r>
+      <w:r>
+        <w:rPr>
+          <w:rStyle w:val="HTMLCode"/>
+          <w:b/>
+          <w:bCs/>
+        </w:rPr>
+        <w:t>uploaded-to-drive/</w:t>
+      </w:r>
+      <w:r>
+        <w:t xml:space="preserve"> folder.</w:t>
+      </w:r>
+    </w:p>
+    <w:p>
+      <w:pPr>
+        <w:pStyle w:val="NormalWeb"/>
+        <w:numPr>
+          <w:ilvl w:val="0"/>
+          <w:numId w:val="19"/>
+        </w:numPr>
+      </w:pPr>
+      <w:r>
+        <w:rPr>
+          <w:b/>
+          <w:bCs/>
+        </w:rPr>
+        <w:t>The Benefit:</w:t>
+      </w:r>
+      <w:r>
+        <w:t xml:space="preserve"> This clears your "input" folder and prevents the system from re-processing the same file.</w:t>
+      </w:r>
+    </w:p>
+    <w:p>
+      <w:pPr>
+        <w:pStyle w:val="Heading3"/>
+      </w:pPr>
+      <w:r>
+        <w:lastRenderedPageBreak/>
+        <w:t>Phase 4: Remote Tracking (</w:t>
+      </w:r>
+      <w:r>
+        <w:rPr>
+          <w:rStyle w:val="HTMLCode"/>
+          <w:rFonts w:eastAsiaTheme="majorEastAsia"/>
+        </w:rPr>
+        <w:t>cloud_sync_init.py</w:t>
+      </w:r>
+      <w:r>
+        <w:t>)</w:t>
+      </w:r>
+    </w:p>
+    <w:p>
+      <w:pPr>
+        <w:pStyle w:val="NormalWeb"/>
+        <w:numPr>
+          <w:ilvl w:val="0"/>
+          <w:numId w:val="20"/>
+        </w:numPr>
+      </w:pPr>
+      <w:r>
+        <w:rPr>
+          <w:b/>
+          <w:bCs/>
+        </w:rPr>
+        <w:t>The Goal:</w:t>
+      </w:r>
+      <w:r>
+        <w:t xml:space="preserve"> Monitor the pipeline health from any location.</w:t>
+      </w:r>
+    </w:p>
+    <w:p>
+      <w:pPr>
+        <w:pStyle w:val="NormalWeb"/>
+        <w:numPr>
+          <w:ilvl w:val="0"/>
+          <w:numId w:val="20"/>
+        </w:numPr>
+      </w:pPr>
+      <w:r>
+        <w:rPr>
+          <w:b/>
+          <w:bCs/>
+        </w:rPr>
+        <w:t>The Work:</w:t>
+      </w:r>
+      <w:r>
+        <w:t xml:space="preserve"> Mirrors the local SQLite status to a </w:t>
+      </w:r>
+      <w:r>
+        <w:rPr>
+          <w:b/>
+          <w:bCs/>
+        </w:rPr>
+        <w:t>Google Sheet</w:t>
+      </w:r>
+      <w:r>
+        <w:t>.</w:t>
+      </w:r>
+    </w:p>
+    <w:p>
+      <w:pPr>
+        <w:pStyle w:val="NormalWeb"/>
+        <w:numPr>
+          <w:ilvl w:val="0"/>
+          <w:numId w:val="20"/>
+        </w:numPr>
+      </w:pPr>
+      <w:r>
+        <w:rPr>
+          <w:b/>
+          <w:bCs/>
+        </w:rPr>
+        <w:t>The Benefit:</w:t>
+      </w:r>
+      <w:r>
+        <w:t xml:space="preserve"> You can track if a video is "Pending" or "Staged" from your phone.</w:t>
+      </w:r>
+    </w:p>
+    <w:p>
+      <w:pPr>
+        <w:pStyle w:val="Heading3"/>
+      </w:pPr>
+      <w:r>
+        <w:t>Phase 5: Final Publishing &amp; Archiving (</w:t>
+      </w:r>
+      <w:r>
+        <w:rPr>
+          <w:rStyle w:val="HTMLCode"/>
+          <w:rFonts w:eastAsiaTheme="majorEastAsia"/>
+        </w:rPr>
+        <w:t>uploader.py</w:t>
+      </w:r>
+      <w:r>
+        <w:t>)</w:t>
+      </w:r>
+    </w:p>
+    <w:p>
+      <w:pPr>
+        <w:pStyle w:val="NormalWeb"/>
+        <w:numPr>
+          <w:ilvl w:val="0"/>
+          <w:numId w:val="21"/>
+        </w:numPr>
+      </w:pPr>
+      <w:r>
+        <w:rPr>
+          <w:b/>
+          <w:bCs/>
+        </w:rPr>
+        <w:t>The Goal:</w:t>
+      </w:r>
+      <w:r>
+        <w:t xml:space="preserve"> Deliver content to YouTube and archive the local file.</w:t>
+      </w:r>
+    </w:p>
+    <w:p>
+      <w:pPr>
+        <w:pStyle w:val="NormalWeb"/>
+        <w:numPr>
+          <w:ilvl w:val="0"/>
+          <w:numId w:val="21"/>
+        </w:numPr>
+      </w:pPr>
+      <w:r>
+        <w:rPr>
+          <w:b/>
+          <w:bCs/>
+        </w:rPr>
+        <w:t>The Work:</w:t>
+      </w:r>
+      <w:r>
+        <w:t xml:space="preserve"> Uses the YouTube API to post the video and metadata.</w:t>
+      </w:r>
+    </w:p>
+    <w:p>
+      <w:pPr>
+        <w:pStyle w:val="NormalWeb"/>
+        <w:numPr>
+          <w:ilvl w:val="0"/>
+          <w:numId w:val="21"/>
+        </w:numPr>
+      </w:pPr>
+      <w:r>
+        <w:rPr>
+          <w:b/>
+          <w:bCs/>
+        </w:rPr>
+        <w:t>The File Movement:</w:t>
+      </w:r>
+      <w:r>
+        <w:t xml:space="preserve"> * </w:t>
+      </w:r>
+      <w:r>
+        <w:rPr>
+          <w:b/>
+          <w:bCs/>
+        </w:rPr>
+        <w:t>On Success:</w:t>
+      </w:r>
+      <w:r>
+        <w:t xml:space="preserve"> The file is moved to the </w:t>
+      </w:r>
+      <w:r>
+        <w:rPr>
+          <w:rStyle w:val="HTMLCode"/>
+          <w:b/>
+          <w:bCs/>
+        </w:rPr>
+        <w:t>uploaded/</w:t>
+      </w:r>
+      <w:r>
+        <w:t xml:space="preserve"> folder.</w:t>
+      </w:r>
+    </w:p>
+    <w:p>
+      <w:pPr>
+        <w:pStyle w:val="NormalWeb"/>
+        <w:numPr>
+          <w:ilvl w:val="1"/>
+          <w:numId w:val="21"/>
+        </w:numPr>
+      </w:pPr>
+      <w:r>
+        <w:rPr>
+          <w:b/>
+          <w:bCs/>
+        </w:rPr>
+        <w:t>On Failure:</w:t>
+      </w:r>
+      <w:r>
+        <w:t xml:space="preserve"> The file is moved to the </w:t>
+      </w:r>
+      <w:r>
+        <w:rPr>
+          <w:rStyle w:val="HTMLCode"/>
+          <w:b/>
+          <w:bCs/>
+        </w:rPr>
+        <w:t>failed/</w:t>
+      </w:r>
+      <w:r>
+        <w:t xml:space="preserve"> folder for manual review.</w:t>
+      </w:r>
+    </w:p>
+    <w:p>
+      <w:pPr>
+        <w:pStyle w:val="NormalWeb"/>
+        <w:numPr>
+          <w:ilvl w:val="0"/>
+          <w:numId w:val="21"/>
+        </w:numPr>
+      </w:pPr>
+      <w:r>
+        <w:rPr>
+          <w:b/>
+          <w:bCs/>
+        </w:rPr>
+        <w:t>The Benefit:</w:t>
+      </w:r>
+      <w:r>
+        <w:t xml:space="preserve"> You have a clear physical record of what was successful and what needs your attention.</w:t>
+      </w:r>
+    </w:p>
+    <w:p>
+      <w:pPr>
+        <w:pStyle w:val="Heading3"/>
+      </w:pPr>
+      <w:r>
+        <w:t>Phase 6: Management Dashboard (</w:t>
+      </w:r>
+      <w:r>
+        <w:rPr>
+          <w:rStyle w:val="HTMLCode"/>
+          <w:rFonts w:eastAsiaTheme="majorEastAsia"/>
+        </w:rPr>
+        <w:t>app.py</w:t>
+      </w:r>
+      <w:r>
+        <w:t>)</w:t>
+      </w:r>
+    </w:p>
+    <w:p>
+      <w:pPr>
+        <w:pStyle w:val="NormalWeb"/>
+        <w:numPr>
+          <w:ilvl w:val="0"/>
+          <w:numId w:val="22"/>
+        </w:numPr>
+      </w:pPr>
+      <w:r>
+        <w:rPr>
+          <w:b/>
+          <w:bCs/>
+        </w:rPr>
+        <w:t>The Goal:</w:t>
+      </w:r>
+      <w:r>
+        <w:t xml:space="preserve"> Provide a centralized "Control Tower."</w:t>
+      </w:r>
+    </w:p>
+    <w:p>
+      <w:pPr>
+        <w:pStyle w:val="NormalWeb"/>
+        <w:numPr>
+          <w:ilvl w:val="0"/>
+          <w:numId w:val="22"/>
+        </w:numPr>
+      </w:pPr>
+      <w:r>
+        <w:rPr>
+          <w:b/>
+          <w:bCs/>
+        </w:rPr>
+        <w:t>The Work:</w:t>
+      </w:r>
+      <w:r>
+        <w:t xml:space="preserve"> A </w:t>
+      </w:r>
+      <w:proofErr w:type="spellStart"/>
+      <w:r>
+        <w:rPr>
+          <w:b/>
+          <w:bCs/>
+        </w:rPr>
+        <w:t>Streamlit</w:t>
+      </w:r>
+      <w:proofErr w:type="spellEnd"/>
+      <w:r>
+        <w:t xml:space="preserve"> web app to visualize progress.</w:t>
+      </w:r>
+    </w:p>
+    <w:p>
+      <w:pPr>
+        <w:pStyle w:val="NormalWeb"/>
+        <w:numPr>
+          <w:ilvl w:val="0"/>
+          <w:numId w:val="22"/>
+        </w:numPr>
+      </w:pPr>
+      <w:r>
+        <w:rPr>
+          <w:b/>
+          <w:bCs/>
+        </w:rPr>
+        <w:t>The Benefit:</w:t>
+      </w:r>
+      <w:r>
+        <w:t xml:space="preserve"> Allows you to override tasks, edit metadata, and see exactly which files are sitting in which folder (Pending vs. Uploaded) through a professional interface.</w:t>
+      </w:r>
+    </w:p>
+    <w:p>
+      <w:r>
+        <w:pict>
+          <v:rect id="_x0000_i1032" style="width:0;height:1.5pt" o:hralign="center" o:hrstd="t" o:hr="t" fillcolor="#a0a0a0" stroked="f"/>
+        </w:pict>
+      </w:r>
+    </w:p>
+    <w:p>
+      <w:pPr>
+        <w:pStyle w:val="Heading3"/>
+      </w:pPr>
+      <w:r>
+        <w:t>The "Recruiter" Summary</w:t>
+      </w:r>
+    </w:p>
+    <w:p>
+      <w:pPr>
+        <w:pStyle w:val="NormalWeb"/>
+        <w:pBdr>
+          <w:bottom w:val="double" w:sz="6" w:space="1" w:color="auto"/>
+        </w:pBdr>
+      </w:pPr>
+      <w:r>
+        <w:t xml:space="preserve">"I built an end-to-end automation pipeline that handles the entire video publishing lifecycle. I implemented </w:t>
+      </w:r>
+      <w:r>
+        <w:rPr>
+          <w:b/>
+          <w:bCs/>
+        </w:rPr>
+        <w:t>automated file-system management</w:t>
+      </w:r>
+      <w:r>
+        <w:t xml:space="preserve"> to move files through different staging folders (Pending </w:t>
+      </w:r>
+      <w:r>
+        <w:rPr>
+          <w:rFonts w:ascii="Segoe UI Symbol" w:hAnsi="Segoe UI Symbol" w:cs="Segoe UI Symbol"/>
+        </w:rPr>
+        <w:t>➔</w:t>
+      </w:r>
+      <w:r>
+        <w:t xml:space="preserve"> Staged </w:t>
+      </w:r>
+      <w:r>
+        <w:rPr>
+          <w:rFonts w:ascii="Segoe UI Symbol" w:hAnsi="Segoe UI Symbol" w:cs="Segoe UI Symbol"/>
+        </w:rPr>
+        <w:t>➔</w:t>
+      </w:r>
+      <w:r>
+        <w:t xml:space="preserve"> Published), ensuring a 100% clean and error-free workflow.</w:t>
+      </w:r>
+    </w:p>
+    <w:p>
+      <w:pPr>
+        <w:rPr>
+          <w:b/>
+        </w:rPr>
+      </w:pPr>
+      <w:r>
+        <w:rPr>
+          <w:b/>
+        </w:rPr>
+        <w:t>Enhancement in project/Upgrade</w:t>
+      </w:r>
+    </w:p>
+    <w:p>
+      <w:pPr>
+        <w:rPr>
+          <w:b/>
+        </w:rPr>
+      </w:pPr>
+    </w:p>
+    <w:p>
+      <w:pPr>
+        <w:pStyle w:val="Heading3"/>
+      </w:pPr>
+      <w:r>
+        <w:t>Summary of Files to Update</w:t>
+      </w:r>
+    </w:p>
+    <w:tbl>
+      <w:tblPr>
+        <w:tblW w:w="0" w:type="auto"/>
+        <w:tblCellSpacing w:w="15" w:type="dxa"/>
+        <w:tblCellMar>
+          <w:top w:w="15" w:type="dxa"/>
+          <w:left w:w="15" w:type="dxa"/>
+          <w:bottom w:w="15" w:type="dxa"/>
+          <w:right w:w="15" w:type="dxa"/>
+        </w:tblCellMar>
+        <w:tblLook w:val="04A0" w:firstRow="1" w:lastRow="0" w:firstColumn="1" w:lastColumn="0" w:noHBand="0" w:noVBand="1"/>
+      </w:tblPr>
+      <w:tblGrid>
+        <w:gridCol w:w="2506"/>
+        <w:gridCol w:w="6504"/>
+      </w:tblGrid>
+      <w:tr>
+        <w:trPr>
+          <w:tblHeader/>
+          <w:tblCellSpacing w:w="15" w:type="dxa"/>
+        </w:trPr>
+        <w:tc>
+          <w:tcPr>
+            <w:tcW w:w="0" w:type="auto"/>
+            <w:tcBorders>
+              <w:top w:val="single" w:sz="6" w:space="0" w:color="auto"/>
+              <w:left w:val="single" w:sz="6" w:space="0" w:color="auto"/>
+              <w:bottom w:val="single" w:sz="6" w:space="0" w:color="auto"/>
+              <w:right w:val="single" w:sz="6" w:space="0" w:color="auto"/>
+            </w:tcBorders>
+            <w:vAlign w:val="center"/>
+            <w:hideMark/>
+          </w:tcPr>
+          <w:p>
+            <w:pPr>
+              <w:spacing w:after="480"/>
+            </w:pPr>
+            <w:r>
+              <w:rPr>
+                <w:rStyle w:val="Strong"/>
+              </w:rPr>
+              <w:t>File</w:t>
+            </w:r>
+          </w:p>
+        </w:tc>
+        <w:tc>
+          <w:tcPr>
+            <w:tcW w:w="0" w:type="auto"/>
+            <w:tcBorders>
+              <w:top w:val="single" w:sz="6" w:space="0" w:color="auto"/>
+              <w:left w:val="single" w:sz="6" w:space="0" w:color="auto"/>
+              <w:bottom w:val="single" w:sz="6" w:space="0" w:color="auto"/>
+              <w:right w:val="single" w:sz="6" w:space="0" w:color="auto"/>
+            </w:tcBorders>
+            <w:vAlign w:val="center"/>
+            <w:hideMark/>
+          </w:tcPr>
+          <w:p>
+            <w:pPr>
+              <w:spacing w:after="480"/>
+            </w:pPr>
+            <w:r>
+              <w:rPr>
+                <w:rStyle w:val="Strong"/>
+              </w:rPr>
+              <w:t>Change Required</w:t>
+            </w:r>
+          </w:p>
+        </w:tc>
+      </w:tr>
+      <w:tr>
+        <w:trPr>
+          <w:tblCellSpacing w:w="15" w:type="dxa"/>
+        </w:trPr>
+        <w:tc>
+          <w:tcPr>
+            <w:tcW w:w="0" w:type="auto"/>
+            <w:tcBorders>
+              <w:top w:val="single" w:sz="6" w:space="0" w:color="auto"/>
+              <w:left w:val="single" w:sz="6" w:space="0" w:color="auto"/>
+              <w:bottom w:val="single" w:sz="6" w:space="0" w:color="auto"/>
+              <w:right w:val="single" w:sz="6" w:space="0" w:color="auto"/>
+            </w:tcBorders>
+            <w:vAlign w:val="center"/>
+            <w:hideMark/>
+          </w:tcPr>
+          <w:p>
+            <w:pPr>
+              <w:spacing w:after="480"/>
+            </w:pPr>
+            <w:r>
+              <w:rPr>
+                <w:rStyle w:val="HTMLCode"/>
+                <w:rFonts w:eastAsiaTheme="majorEastAsia"/>
+                <w:b/>
+                <w:bCs/>
+              </w:rPr>
+              <w:t>src/init_db.py</w:t>
+            </w:r>
+          </w:p>
+        </w:tc>
+        <w:tc>
+          <w:tcPr>
+            <w:tcW w:w="0" w:type="auto"/>
+            <w:tcBorders>
+              <w:top w:val="single" w:sz="6" w:space="0" w:color="auto"/>
+              <w:left w:val="single" w:sz="6" w:space="0" w:color="auto"/>
+              <w:bottom w:val="single" w:sz="6" w:space="0" w:color="auto"/>
+              <w:right w:val="single" w:sz="6" w:space="0" w:color="auto"/>
+            </w:tcBorders>
+            <w:vAlign w:val="center"/>
+            <w:hideMark/>
+          </w:tcPr>
+          <w:p>
+            <w:pPr>
+              <w:spacing w:after="480"/>
+            </w:pPr>
+            <w:r>
+              <w:t xml:space="preserve">Add columns for </w:t>
+            </w:r>
+            <w:r>
+              <w:rPr>
+                <w:rStyle w:val="HTMLCode"/>
+                <w:rFonts w:eastAsiaTheme="majorEastAsia"/>
+              </w:rPr>
+              <w:t>views</w:t>
+            </w:r>
+            <w:r>
+              <w:t xml:space="preserve">, </w:t>
+            </w:r>
+            <w:r>
+              <w:rPr>
+                <w:rStyle w:val="HTMLCode"/>
+                <w:rFonts w:eastAsiaTheme="majorEastAsia"/>
+              </w:rPr>
+              <w:t>likes</w:t>
+            </w:r>
+            <w:r>
+              <w:t xml:space="preserve">, </w:t>
+            </w:r>
+            <w:proofErr w:type="spellStart"/>
+            <w:r>
+              <w:rPr>
+                <w:rStyle w:val="HTMLCode"/>
+                <w:rFonts w:eastAsiaTheme="majorEastAsia"/>
+              </w:rPr>
+              <w:t>scheduled_at</w:t>
+            </w:r>
+            <w:proofErr w:type="spellEnd"/>
+            <w:r>
+              <w:t xml:space="preserve">, and the </w:t>
+            </w:r>
+            <w:proofErr w:type="spellStart"/>
+            <w:r>
+              <w:rPr>
+                <w:rStyle w:val="HTMLCode"/>
+                <w:rFonts w:eastAsiaTheme="majorEastAsia"/>
+              </w:rPr>
+              <w:t>system_audit</w:t>
+            </w:r>
+            <w:proofErr w:type="spellEnd"/>
+            <w:r>
+              <w:t xml:space="preserve"> table.</w:t>
+            </w:r>
+          </w:p>
+        </w:tc>
+      </w:tr>
+      <w:tr>
+        <w:trPr>
+          <w:tblCellSpacing w:w="15" w:type="dxa"/>
+        </w:trPr>
+        <w:tc>
+          <w:tcPr>
+            <w:tcW w:w="0" w:type="auto"/>
+            <w:tcBorders>
+              <w:top w:val="single" w:sz="6" w:space="0" w:color="auto"/>
+              <w:left w:val="single" w:sz="6" w:space="0" w:color="auto"/>
+              <w:bottom w:val="single" w:sz="6" w:space="0" w:color="auto"/>
+              <w:right w:val="single" w:sz="6" w:space="0" w:color="auto"/>
+            </w:tcBorders>
+            <w:vAlign w:val="center"/>
+            <w:hideMark/>
+          </w:tcPr>
+          <w:p>
+            <w:pPr>
+              <w:spacing w:after="480"/>
+            </w:pPr>
+            <w:r>
+              <w:rPr>
+                <w:rStyle w:val="HTMLCode"/>
+                <w:rFonts w:eastAsiaTheme="majorEastAsia"/>
+                <w:b/>
+                <w:bCs/>
+              </w:rPr>
+              <w:t>src/uploader.py</w:t>
+            </w:r>
+          </w:p>
+        </w:tc>
+        <w:tc>
+          <w:tcPr>
+            <w:tcW w:w="0" w:type="auto"/>
+            <w:tcBorders>
+              <w:top w:val="single" w:sz="6" w:space="0" w:color="auto"/>
+              <w:left w:val="single" w:sz="6" w:space="0" w:color="auto"/>
+              <w:bottom w:val="single" w:sz="6" w:space="0" w:color="auto"/>
+              <w:right w:val="single" w:sz="6" w:space="0" w:color="auto"/>
+            </w:tcBorders>
+            <w:vAlign w:val="center"/>
+            <w:hideMark/>
+          </w:tcPr>
+          <w:p>
+            <w:pPr>
+              <w:spacing w:after="480"/>
+            </w:pPr>
+            <w:r>
+              <w:t>Add logic to handle the "Schedule" parameter and update the DB status.</w:t>
+            </w:r>
+          </w:p>
+        </w:tc>
+      </w:tr>
+      <w:tr>
+        <w:trPr>
+          <w:tblCellSpacing w:w="15" w:type="dxa"/>
+        </w:trPr>
+        <w:tc>
+          <w:tcPr>
+            <w:tcW w:w="0" w:type="auto"/>
+            <w:tcBorders>
+              <w:top w:val="single" w:sz="6" w:space="0" w:color="auto"/>
+              <w:left w:val="single" w:sz="6" w:space="0" w:color="auto"/>
+              <w:bottom w:val="single" w:sz="6" w:space="0" w:color="auto"/>
+              <w:right w:val="single" w:sz="6" w:space="0" w:color="auto"/>
+            </w:tcBorders>
+            <w:vAlign w:val="center"/>
+            <w:hideMark/>
+          </w:tcPr>
+          <w:p>
+            <w:pPr>
+              <w:spacing w:after="480"/>
+            </w:pPr>
+            <w:r>
+              <w:rPr>
+                <w:rStyle w:val="HTMLCode"/>
+                <w:rFonts w:eastAsiaTheme="majorEastAsia"/>
+                <w:b/>
+                <w:bCs/>
+              </w:rPr>
+              <w:t>executor.py</w:t>
+            </w:r>
+          </w:p>
+        </w:tc>
+        <w:tc>
+          <w:tcPr>
+            <w:tcW w:w="0" w:type="auto"/>
+            <w:tcBorders>
+              <w:top w:val="single" w:sz="6" w:space="0" w:color="auto"/>
+              <w:left w:val="single" w:sz="6" w:space="0" w:color="auto"/>
+              <w:bottom w:val="single" w:sz="6" w:space="0" w:color="auto"/>
+              <w:right w:val="single" w:sz="6" w:space="0" w:color="auto"/>
+            </w:tcBorders>
+            <w:vAlign w:val="center"/>
+            <w:hideMark/>
+          </w:tcPr>
+          <w:p>
+            <w:pPr>
+              <w:spacing w:after="480"/>
+            </w:pPr>
+            <w:r>
+              <w:t>Add a final step to record the folder file counts (Snapshot).</w:t>
+            </w:r>
+          </w:p>
+        </w:tc>
+      </w:tr>
+      <w:tr>
+        <w:trPr>
+          <w:tblCellSpacing w:w="15" w:type="dxa"/>
+        </w:trPr>
+        <w:tc>
+          <w:tcPr>
+            <w:tcW w:w="0" w:type="auto"/>
+            <w:tcBorders>
+              <w:top w:val="single" w:sz="6" w:space="0" w:color="auto"/>
+              <w:left w:val="single" w:sz="6" w:space="0" w:color="auto"/>
+              <w:bottom w:val="single" w:sz="6" w:space="0" w:color="auto"/>
+              <w:right w:val="single" w:sz="6" w:space="0" w:color="auto"/>
+            </w:tcBorders>
+            <w:vAlign w:val="center"/>
+            <w:hideMark/>
+          </w:tcPr>
+          <w:p>
+            <w:pPr>
+              <w:spacing w:after="480"/>
+            </w:pPr>
+            <w:r>
+              <w:rPr>
+                <w:rStyle w:val="HTMLCode"/>
+                <w:rFonts w:eastAsiaTheme="majorEastAsia"/>
+                <w:b/>
+                <w:bCs/>
+              </w:rPr>
+              <w:lastRenderedPageBreak/>
+              <w:t>src/stats_fetcher.py</w:t>
+            </w:r>
+          </w:p>
+        </w:tc>
+        <w:tc>
+          <w:tcPr>
+            <w:tcW w:w="0" w:type="auto"/>
+            <w:tcBorders>
+              <w:top w:val="single" w:sz="6" w:space="0" w:color="auto"/>
+              <w:left w:val="single" w:sz="6" w:space="0" w:color="auto"/>
+              <w:bottom w:val="single" w:sz="6" w:space="0" w:color="auto"/>
+              <w:right w:val="single" w:sz="6" w:space="0" w:color="auto"/>
+            </w:tcBorders>
+            <w:vAlign w:val="center"/>
+            <w:hideMark/>
+          </w:tcPr>
+          <w:p>
+            <w:pPr>
+              <w:spacing w:after="480"/>
+            </w:pPr>
+            <w:r>
+              <w:rPr>
+                <w:b/>
+                <w:bCs/>
+              </w:rPr>
+              <w:t>(Create New)</w:t>
+            </w:r>
+            <w:r>
+              <w:t xml:space="preserve"> To pull performance data into the </w:t>
+            </w:r>
+            <w:r>
+              <w:rPr>
+                <w:rStyle w:val="HTMLCode"/>
+                <w:rFonts w:eastAsiaTheme="majorEastAsia"/>
+              </w:rPr>
+              <w:t>.db</w:t>
+            </w:r>
+            <w:r>
+              <w:t>.</w:t>
+            </w:r>
+          </w:p>
+        </w:tc>
+      </w:tr>
+    </w:tbl>
+    <w:p>
+      <w:pPr>
+        <w:rPr>
+          <w:b/>
+        </w:rPr>
+      </w:pPr>
       <w:bookmarkStart w:id="0" w:name="_GoBack"/>
       <w:bookmarkEnd w:id="0"/>
     </w:p>
@@ -1532,6 +3255,304 @@
 <file path=word/numbering.xml><?xml version="1.0" encoding="utf-8"?>
 <w:numbering xmlns:wpc="http://schemas.microsoft.com/office/word/2010/wordprocessingCanvas" xmlns:cx="http://schemas.microsoft.com/office/drawing/2014/chartex" xmlns:mc="http://schemas.openxmlformats.org/markup-compatibility/2006" xmlns:o="urn:schemas-microsoft-com:office:office" xmlns:r="http://schemas.openxmlformats.org/officeDocument/2006/relationships" xmlns:m="http://schemas.openxmlformats.org/officeDocument/2006/math" xmlns:v="urn:schemas-microsoft-com:vml" xmlns:wp14="http://schemas.microsoft.com/office/word/2010/wordprocessingDrawing" xmlns:wp="http://schemas.openxmlformats.org/drawingml/2006/wordprocessingDrawing" xmlns:w10="urn:schemas-microsoft-com:office:word" xmlns:w="http://schemas.openxmlformats.org/wordprocessingml/2006/main" xmlns:w14="http://schemas.microsoft.com/office/word/2010/wordml" xmlns:w15="http://schemas.microsoft.com/office/word/2012/wordml" xmlns:w16se="http://schemas.microsoft.com/office/word/2015/wordml/symex" xmlns:wpg="http://schemas.microsoft.com/office/word/2010/wordprocessingGroup" xmlns:wpi="http://schemas.microsoft.com/office/word/2010/wordprocessingInk" xmlns:wne="http://schemas.microsoft.com/office/word/2006/wordml" xmlns:wps="http://schemas.microsoft.com/office/word/2010/wordprocessingShape" mc:Ignorable="w14 w15 w16se wp14">
   <w:abstractNum w:abstractNumId="0" w15:restartNumberingAfterBreak="0">
+    <w:nsid w:val="00B673D7"/>
+    <w:multiLevelType w:val="multilevel"/>
+    <w:tmpl w:val="AFB4287C"/>
+    <w:lvl w:ilvl="0">
+      <w:start w:val="1"/>
+      <w:numFmt w:val="bullet"/>
+      <w:lvlText w:val=""/>
+      <w:lvlJc w:val="left"/>
+      <w:pPr>
+        <w:tabs>
+          <w:tab w:val="num" w:pos="720"/>
+        </w:tabs>
+        <w:ind w:left="720" w:hanging="360"/>
+      </w:pPr>
+      <w:rPr>
+        <w:rFonts w:ascii="Symbol" w:hAnsi="Symbol" w:hint="default"/>
+        <w:sz w:val="20"/>
+      </w:rPr>
+    </w:lvl>
+    <w:lvl w:ilvl="1" w:tentative="1">
+      <w:start w:val="1"/>
+      <w:numFmt w:val="bullet"/>
+      <w:lvlText w:val="o"/>
+      <w:lvlJc w:val="left"/>
+      <w:pPr>
+        <w:tabs>
+          <w:tab w:val="num" w:pos="1440"/>
+        </w:tabs>
+        <w:ind w:left="1440" w:hanging="360"/>
+      </w:pPr>
+      <w:rPr>
+        <w:rFonts w:ascii="Courier New" w:hAnsi="Courier New" w:hint="default"/>
+        <w:sz w:val="20"/>
+      </w:rPr>
+    </w:lvl>
+    <w:lvl w:ilvl="2" w:tentative="1">
+      <w:start w:val="1"/>
+      <w:numFmt w:val="bullet"/>
+      <w:lvlText w:val=""/>
+      <w:lvlJc w:val="left"/>
+      <w:pPr>
+        <w:tabs>
+          <w:tab w:val="num" w:pos="2160"/>
+        </w:tabs>
+        <w:ind w:left="2160" w:hanging="360"/>
+      </w:pPr>
+      <w:rPr>
+        <w:rFonts w:ascii="Wingdings" w:hAnsi="Wingdings" w:hint="default"/>
+        <w:sz w:val="20"/>
+      </w:rPr>
+    </w:lvl>
+    <w:lvl w:ilvl="3" w:tentative="1">
+      <w:start w:val="1"/>
+      <w:numFmt w:val="bullet"/>
+      <w:lvlText w:val=""/>
+      <w:lvlJc w:val="left"/>
+      <w:pPr>
+        <w:tabs>
+          <w:tab w:val="num" w:pos="2880"/>
+        </w:tabs>
+        <w:ind w:left="2880" w:hanging="360"/>
+      </w:pPr>
+      <w:rPr>
+        <w:rFonts w:ascii="Wingdings" w:hAnsi="Wingdings" w:hint="default"/>
+        <w:sz w:val="20"/>
+      </w:rPr>
+    </w:lvl>
+    <w:lvl w:ilvl="4" w:tentative="1">
+      <w:start w:val="1"/>
+      <w:numFmt w:val="bullet"/>
+      <w:lvlText w:val=""/>
+      <w:lvlJc w:val="left"/>
+      <w:pPr>
+        <w:tabs>
+          <w:tab w:val="num" w:pos="3600"/>
+        </w:tabs>
+        <w:ind w:left="3600" w:hanging="360"/>
+      </w:pPr>
+      <w:rPr>
+        <w:rFonts w:ascii="Wingdings" w:hAnsi="Wingdings" w:hint="default"/>
+        <w:sz w:val="20"/>
+      </w:rPr>
+    </w:lvl>
+    <w:lvl w:ilvl="5" w:tentative="1">
+      <w:start w:val="1"/>
+      <w:numFmt w:val="bullet"/>
+      <w:lvlText w:val=""/>
+      <w:lvlJc w:val="left"/>
+      <w:pPr>
+        <w:tabs>
+          <w:tab w:val="num" w:pos="4320"/>
+        </w:tabs>
+        <w:ind w:left="4320" w:hanging="360"/>
+      </w:pPr>
+      <w:rPr>
+        <w:rFonts w:ascii="Wingdings" w:hAnsi="Wingdings" w:hint="default"/>
+        <w:sz w:val="20"/>
+      </w:rPr>
+    </w:lvl>
+    <w:lvl w:ilvl="6" w:tentative="1">
+      <w:start w:val="1"/>
+      <w:numFmt w:val="bullet"/>
+      <w:lvlText w:val=""/>
+      <w:lvlJc w:val="left"/>
+      <w:pPr>
+        <w:tabs>
+          <w:tab w:val="num" w:pos="5040"/>
+        </w:tabs>
+        <w:ind w:left="5040" w:hanging="360"/>
+      </w:pPr>
+      <w:rPr>
+        <w:rFonts w:ascii="Wingdings" w:hAnsi="Wingdings" w:hint="default"/>
+        <w:sz w:val="20"/>
+      </w:rPr>
+    </w:lvl>
+    <w:lvl w:ilvl="7" w:tentative="1">
+      <w:start w:val="1"/>
+      <w:numFmt w:val="bullet"/>
+      <w:lvlText w:val=""/>
+      <w:lvlJc w:val="left"/>
+      <w:pPr>
+        <w:tabs>
+          <w:tab w:val="num" w:pos="5760"/>
+        </w:tabs>
+        <w:ind w:left="5760" w:hanging="360"/>
+      </w:pPr>
+      <w:rPr>
+        <w:rFonts w:ascii="Wingdings" w:hAnsi="Wingdings" w:hint="default"/>
+        <w:sz w:val="20"/>
+      </w:rPr>
+    </w:lvl>
+    <w:lvl w:ilvl="8" w:tentative="1">
+      <w:start w:val="1"/>
+      <w:numFmt w:val="bullet"/>
+      <w:lvlText w:val=""/>
+      <w:lvlJc w:val="left"/>
+      <w:pPr>
+        <w:tabs>
+          <w:tab w:val="num" w:pos="6480"/>
+        </w:tabs>
+        <w:ind w:left="6480" w:hanging="360"/>
+      </w:pPr>
+      <w:rPr>
+        <w:rFonts w:ascii="Wingdings" w:hAnsi="Wingdings" w:hint="default"/>
+        <w:sz w:val="20"/>
+      </w:rPr>
+    </w:lvl>
+  </w:abstractNum>
+  <w:abstractNum w:abstractNumId="1" w15:restartNumberingAfterBreak="0">
+    <w:nsid w:val="04EC0825"/>
+    <w:multiLevelType w:val="multilevel"/>
+    <w:tmpl w:val="543857EA"/>
+    <w:lvl w:ilvl="0">
+      <w:start w:val="1"/>
+      <w:numFmt w:val="bullet"/>
+      <w:lvlText w:val=""/>
+      <w:lvlJc w:val="left"/>
+      <w:pPr>
+        <w:tabs>
+          <w:tab w:val="num" w:pos="720"/>
+        </w:tabs>
+        <w:ind w:left="720" w:hanging="360"/>
+      </w:pPr>
+      <w:rPr>
+        <w:rFonts w:ascii="Symbol" w:hAnsi="Symbol" w:hint="default"/>
+        <w:sz w:val="20"/>
+      </w:rPr>
+    </w:lvl>
+    <w:lvl w:ilvl="1" w:tentative="1">
+      <w:start w:val="1"/>
+      <w:numFmt w:val="bullet"/>
+      <w:lvlText w:val="o"/>
+      <w:lvlJc w:val="left"/>
+      <w:pPr>
+        <w:tabs>
+          <w:tab w:val="num" w:pos="1440"/>
+        </w:tabs>
+        <w:ind w:left="1440" w:hanging="360"/>
+      </w:pPr>
+      <w:rPr>
+        <w:rFonts w:ascii="Courier New" w:hAnsi="Courier New" w:hint="default"/>
+        <w:sz w:val="20"/>
+      </w:rPr>
+    </w:lvl>
+    <w:lvl w:ilvl="2" w:tentative="1">
+      <w:start w:val="1"/>
+      <w:numFmt w:val="bullet"/>
+      <w:lvlText w:val=""/>
+      <w:lvlJc w:val="left"/>
+      <w:pPr>
+        <w:tabs>
+          <w:tab w:val="num" w:pos="2160"/>
+        </w:tabs>
+        <w:ind w:left="2160" w:hanging="360"/>
+      </w:pPr>
+      <w:rPr>
+        <w:rFonts w:ascii="Wingdings" w:hAnsi="Wingdings" w:hint="default"/>
+        <w:sz w:val="20"/>
+      </w:rPr>
+    </w:lvl>
+    <w:lvl w:ilvl="3" w:tentative="1">
+      <w:start w:val="1"/>
+      <w:numFmt w:val="bullet"/>
+      <w:lvlText w:val=""/>
+      <w:lvlJc w:val="left"/>
+      <w:pPr>
+        <w:tabs>
+          <w:tab w:val="num" w:pos="2880"/>
+        </w:tabs>
+        <w:ind w:left="2880" w:hanging="360"/>
+      </w:pPr>
+      <w:rPr>
+        <w:rFonts w:ascii="Wingdings" w:hAnsi="Wingdings" w:hint="default"/>
+        <w:sz w:val="20"/>
+      </w:rPr>
+    </w:lvl>
+    <w:lvl w:ilvl="4" w:tentative="1">
+      <w:start w:val="1"/>
+      <w:numFmt w:val="bullet"/>
+      <w:lvlText w:val=""/>
+      <w:lvlJc w:val="left"/>
+      <w:pPr>
+        <w:tabs>
+          <w:tab w:val="num" w:pos="3600"/>
+        </w:tabs>
+        <w:ind w:left="3600" w:hanging="360"/>
+      </w:pPr>
+      <w:rPr>
+        <w:rFonts w:ascii="Wingdings" w:hAnsi="Wingdings" w:hint="default"/>
+        <w:sz w:val="20"/>
+      </w:rPr>
+    </w:lvl>
+    <w:lvl w:ilvl="5" w:tentative="1">
+      <w:start w:val="1"/>
+      <w:numFmt w:val="bullet"/>
+      <w:lvlText w:val=""/>
+      <w:lvlJc w:val="left"/>
+      <w:pPr>
+        <w:tabs>
+          <w:tab w:val="num" w:pos="4320"/>
+        </w:tabs>
+        <w:ind w:left="4320" w:hanging="360"/>
+      </w:pPr>
+      <w:rPr>
+        <w:rFonts w:ascii="Wingdings" w:hAnsi="Wingdings" w:hint="default"/>
+        <w:sz w:val="20"/>
+      </w:rPr>
+    </w:lvl>
+    <w:lvl w:ilvl="6" w:tentative="1">
+      <w:start w:val="1"/>
+      <w:numFmt w:val="bullet"/>
+      <w:lvlText w:val=""/>
+      <w:lvlJc w:val="left"/>
+      <w:pPr>
+        <w:tabs>
+          <w:tab w:val="num" w:pos="5040"/>
+        </w:tabs>
+        <w:ind w:left="5040" w:hanging="360"/>
+      </w:pPr>
+      <w:rPr>
+        <w:rFonts w:ascii="Wingdings" w:hAnsi="Wingdings" w:hint="default"/>
+        <w:sz w:val="20"/>
+      </w:rPr>
+    </w:lvl>
+    <w:lvl w:ilvl="7" w:tentative="1">
+      <w:start w:val="1"/>
+      <w:numFmt w:val="bullet"/>
+      <w:lvlText w:val=""/>
+      <w:lvlJc w:val="left"/>
+      <w:pPr>
+        <w:tabs>
+          <w:tab w:val="num" w:pos="5760"/>
+        </w:tabs>
+        <w:ind w:left="5760" w:hanging="360"/>
+      </w:pPr>
+      <w:rPr>
+        <w:rFonts w:ascii="Wingdings" w:hAnsi="Wingdings" w:hint="default"/>
+        <w:sz w:val="20"/>
+      </w:rPr>
+    </w:lvl>
+    <w:lvl w:ilvl="8" w:tentative="1">
+      <w:start w:val="1"/>
+      <w:numFmt w:val="bullet"/>
+      <w:lvlText w:val=""/>
+      <w:lvlJc w:val="left"/>
+      <w:pPr>
+        <w:tabs>
+          <w:tab w:val="num" w:pos="6480"/>
+        </w:tabs>
+        <w:ind w:left="6480" w:hanging="360"/>
+      </w:pPr>
+      <w:rPr>
+        <w:rFonts w:ascii="Wingdings" w:hAnsi="Wingdings" w:hint="default"/>
+        <w:sz w:val="20"/>
+      </w:rPr>
+    </w:lvl>
+  </w:abstractNum>
+  <w:abstractNum w:abstractNumId="2" w15:restartNumberingAfterBreak="0">
     <w:nsid w:val="06B74D17"/>
     <w:multiLevelType w:val="multilevel"/>
     <w:tmpl w:val="3B443304"/>
@@ -1644,7 +3665,305 @@
       </w:pPr>
     </w:lvl>
   </w:abstractNum>
-  <w:abstractNum w:abstractNumId="1" w15:restartNumberingAfterBreak="0">
+  <w:abstractNum w:abstractNumId="3" w15:restartNumberingAfterBreak="0">
+    <w:nsid w:val="1062247A"/>
+    <w:multiLevelType w:val="multilevel"/>
+    <w:tmpl w:val="238E41DA"/>
+    <w:lvl w:ilvl="0">
+      <w:start w:val="1"/>
+      <w:numFmt w:val="bullet"/>
+      <w:lvlText w:val=""/>
+      <w:lvlJc w:val="left"/>
+      <w:pPr>
+        <w:tabs>
+          <w:tab w:val="num" w:pos="720"/>
+        </w:tabs>
+        <w:ind w:left="720" w:hanging="360"/>
+      </w:pPr>
+      <w:rPr>
+        <w:rFonts w:ascii="Symbol" w:hAnsi="Symbol" w:hint="default"/>
+        <w:sz w:val="20"/>
+      </w:rPr>
+    </w:lvl>
+    <w:lvl w:ilvl="1" w:tentative="1">
+      <w:start w:val="1"/>
+      <w:numFmt w:val="bullet"/>
+      <w:lvlText w:val="o"/>
+      <w:lvlJc w:val="left"/>
+      <w:pPr>
+        <w:tabs>
+          <w:tab w:val="num" w:pos="1440"/>
+        </w:tabs>
+        <w:ind w:left="1440" w:hanging="360"/>
+      </w:pPr>
+      <w:rPr>
+        <w:rFonts w:ascii="Courier New" w:hAnsi="Courier New" w:hint="default"/>
+        <w:sz w:val="20"/>
+      </w:rPr>
+    </w:lvl>
+    <w:lvl w:ilvl="2" w:tentative="1">
+      <w:start w:val="1"/>
+      <w:numFmt w:val="bullet"/>
+      <w:lvlText w:val=""/>
+      <w:lvlJc w:val="left"/>
+      <w:pPr>
+        <w:tabs>
+          <w:tab w:val="num" w:pos="2160"/>
+        </w:tabs>
+        <w:ind w:left="2160" w:hanging="360"/>
+      </w:pPr>
+      <w:rPr>
+        <w:rFonts w:ascii="Wingdings" w:hAnsi="Wingdings" w:hint="default"/>
+        <w:sz w:val="20"/>
+      </w:rPr>
+    </w:lvl>
+    <w:lvl w:ilvl="3" w:tentative="1">
+      <w:start w:val="1"/>
+      <w:numFmt w:val="bullet"/>
+      <w:lvlText w:val=""/>
+      <w:lvlJc w:val="left"/>
+      <w:pPr>
+        <w:tabs>
+          <w:tab w:val="num" w:pos="2880"/>
+        </w:tabs>
+        <w:ind w:left="2880" w:hanging="360"/>
+      </w:pPr>
+      <w:rPr>
+        <w:rFonts w:ascii="Wingdings" w:hAnsi="Wingdings" w:hint="default"/>
+        <w:sz w:val="20"/>
+      </w:rPr>
+    </w:lvl>
+    <w:lvl w:ilvl="4" w:tentative="1">
+      <w:start w:val="1"/>
+      <w:numFmt w:val="bullet"/>
+      <w:lvlText w:val=""/>
+      <w:lvlJc w:val="left"/>
+      <w:pPr>
+        <w:tabs>
+          <w:tab w:val="num" w:pos="3600"/>
+        </w:tabs>
+        <w:ind w:left="3600" w:hanging="360"/>
+      </w:pPr>
+      <w:rPr>
+        <w:rFonts w:ascii="Wingdings" w:hAnsi="Wingdings" w:hint="default"/>
+        <w:sz w:val="20"/>
+      </w:rPr>
+    </w:lvl>
+    <w:lvl w:ilvl="5" w:tentative="1">
+      <w:start w:val="1"/>
+      <w:numFmt w:val="bullet"/>
+      <w:lvlText w:val=""/>
+      <w:lvlJc w:val="left"/>
+      <w:pPr>
+        <w:tabs>
+          <w:tab w:val="num" w:pos="4320"/>
+        </w:tabs>
+        <w:ind w:left="4320" w:hanging="360"/>
+      </w:pPr>
+      <w:rPr>
+        <w:rFonts w:ascii="Wingdings" w:hAnsi="Wingdings" w:hint="default"/>
+        <w:sz w:val="20"/>
+      </w:rPr>
+    </w:lvl>
+    <w:lvl w:ilvl="6" w:tentative="1">
+      <w:start w:val="1"/>
+      <w:numFmt w:val="bullet"/>
+      <w:lvlText w:val=""/>
+      <w:lvlJc w:val="left"/>
+      <w:pPr>
+        <w:tabs>
+          <w:tab w:val="num" w:pos="5040"/>
+        </w:tabs>
+        <w:ind w:left="5040" w:hanging="360"/>
+      </w:pPr>
+      <w:rPr>
+        <w:rFonts w:ascii="Wingdings" w:hAnsi="Wingdings" w:hint="default"/>
+        <w:sz w:val="20"/>
+      </w:rPr>
+    </w:lvl>
+    <w:lvl w:ilvl="7" w:tentative="1">
+      <w:start w:val="1"/>
+      <w:numFmt w:val="bullet"/>
+      <w:lvlText w:val=""/>
+      <w:lvlJc w:val="left"/>
+      <w:pPr>
+        <w:tabs>
+          <w:tab w:val="num" w:pos="5760"/>
+        </w:tabs>
+        <w:ind w:left="5760" w:hanging="360"/>
+      </w:pPr>
+      <w:rPr>
+        <w:rFonts w:ascii="Wingdings" w:hAnsi="Wingdings" w:hint="default"/>
+        <w:sz w:val="20"/>
+      </w:rPr>
+    </w:lvl>
+    <w:lvl w:ilvl="8" w:tentative="1">
+      <w:start w:val="1"/>
+      <w:numFmt w:val="bullet"/>
+      <w:lvlText w:val=""/>
+      <w:lvlJc w:val="left"/>
+      <w:pPr>
+        <w:tabs>
+          <w:tab w:val="num" w:pos="6480"/>
+        </w:tabs>
+        <w:ind w:left="6480" w:hanging="360"/>
+      </w:pPr>
+      <w:rPr>
+        <w:rFonts w:ascii="Wingdings" w:hAnsi="Wingdings" w:hint="default"/>
+        <w:sz w:val="20"/>
+      </w:rPr>
+    </w:lvl>
+  </w:abstractNum>
+  <w:abstractNum w:abstractNumId="4" w15:restartNumberingAfterBreak="0">
+    <w:nsid w:val="15C54CB3"/>
+    <w:multiLevelType w:val="multilevel"/>
+    <w:tmpl w:val="5F7C6C6A"/>
+    <w:lvl w:ilvl="0">
+      <w:start w:val="1"/>
+      <w:numFmt w:val="bullet"/>
+      <w:lvlText w:val=""/>
+      <w:lvlJc w:val="left"/>
+      <w:pPr>
+        <w:tabs>
+          <w:tab w:val="num" w:pos="720"/>
+        </w:tabs>
+        <w:ind w:left="720" w:hanging="360"/>
+      </w:pPr>
+      <w:rPr>
+        <w:rFonts w:ascii="Symbol" w:hAnsi="Symbol" w:hint="default"/>
+        <w:sz w:val="20"/>
+      </w:rPr>
+    </w:lvl>
+    <w:lvl w:ilvl="1" w:tentative="1">
+      <w:start w:val="1"/>
+      <w:numFmt w:val="bullet"/>
+      <w:lvlText w:val="o"/>
+      <w:lvlJc w:val="left"/>
+      <w:pPr>
+        <w:tabs>
+          <w:tab w:val="num" w:pos="1440"/>
+        </w:tabs>
+        <w:ind w:left="1440" w:hanging="360"/>
+      </w:pPr>
+      <w:rPr>
+        <w:rFonts w:ascii="Courier New" w:hAnsi="Courier New" w:hint="default"/>
+        <w:sz w:val="20"/>
+      </w:rPr>
+    </w:lvl>
+    <w:lvl w:ilvl="2" w:tentative="1">
+      <w:start w:val="1"/>
+      <w:numFmt w:val="bullet"/>
+      <w:lvlText w:val=""/>
+      <w:lvlJc w:val="left"/>
+      <w:pPr>
+        <w:tabs>
+          <w:tab w:val="num" w:pos="2160"/>
+        </w:tabs>
+        <w:ind w:left="2160" w:hanging="360"/>
+      </w:pPr>
+      <w:rPr>
+        <w:rFonts w:ascii="Wingdings" w:hAnsi="Wingdings" w:hint="default"/>
+        <w:sz w:val="20"/>
+      </w:rPr>
+    </w:lvl>
+    <w:lvl w:ilvl="3" w:tentative="1">
+      <w:start w:val="1"/>
+      <w:numFmt w:val="bullet"/>
+      <w:lvlText w:val=""/>
+      <w:lvlJc w:val="left"/>
+      <w:pPr>
+        <w:tabs>
+          <w:tab w:val="num" w:pos="2880"/>
+        </w:tabs>
+        <w:ind w:left="2880" w:hanging="360"/>
+      </w:pPr>
+      <w:rPr>
+        <w:rFonts w:ascii="Wingdings" w:hAnsi="Wingdings" w:hint="default"/>
+        <w:sz w:val="20"/>
+      </w:rPr>
+    </w:lvl>
+    <w:lvl w:ilvl="4" w:tentative="1">
+      <w:start w:val="1"/>
+      <w:numFmt w:val="bullet"/>
+      <w:lvlText w:val=""/>
+      <w:lvlJc w:val="left"/>
+      <w:pPr>
+        <w:tabs>
+          <w:tab w:val="num" w:pos="3600"/>
+        </w:tabs>
+        <w:ind w:left="3600" w:hanging="360"/>
+      </w:pPr>
+      <w:rPr>
+        <w:rFonts w:ascii="Wingdings" w:hAnsi="Wingdings" w:hint="default"/>
+        <w:sz w:val="20"/>
+      </w:rPr>
+    </w:lvl>
+    <w:lvl w:ilvl="5" w:tentative="1">
+      <w:start w:val="1"/>
+      <w:numFmt w:val="bullet"/>
+      <w:lvlText w:val=""/>
+      <w:lvlJc w:val="left"/>
+      <w:pPr>
+        <w:tabs>
+          <w:tab w:val="num" w:pos="4320"/>
+        </w:tabs>
+        <w:ind w:left="4320" w:hanging="360"/>
+      </w:pPr>
+      <w:rPr>
+        <w:rFonts w:ascii="Wingdings" w:hAnsi="Wingdings" w:hint="default"/>
+        <w:sz w:val="20"/>
+      </w:rPr>
+    </w:lvl>
+    <w:lvl w:ilvl="6" w:tentative="1">
+      <w:start w:val="1"/>
+      <w:numFmt w:val="bullet"/>
+      <w:lvlText w:val=""/>
+      <w:lvlJc w:val="left"/>
+      <w:pPr>
+        <w:tabs>
+          <w:tab w:val="num" w:pos="5040"/>
+        </w:tabs>
+        <w:ind w:left="5040" w:hanging="360"/>
+      </w:pPr>
+      <w:rPr>
+        <w:rFonts w:ascii="Wingdings" w:hAnsi="Wingdings" w:hint="default"/>
+        <w:sz w:val="20"/>
+      </w:rPr>
+    </w:lvl>
+    <w:lvl w:ilvl="7" w:tentative="1">
+      <w:start w:val="1"/>
+      <w:numFmt w:val="bullet"/>
+      <w:lvlText w:val=""/>
+      <w:lvlJc w:val="left"/>
+      <w:pPr>
+        <w:tabs>
+          <w:tab w:val="num" w:pos="5760"/>
+        </w:tabs>
+        <w:ind w:left="5760" w:hanging="360"/>
+      </w:pPr>
+      <w:rPr>
+        <w:rFonts w:ascii="Wingdings" w:hAnsi="Wingdings" w:hint="default"/>
+        <w:sz w:val="20"/>
+      </w:rPr>
+    </w:lvl>
+    <w:lvl w:ilvl="8" w:tentative="1">
+      <w:start w:val="1"/>
+      <w:numFmt w:val="bullet"/>
+      <w:lvlText w:val=""/>
+      <w:lvlJc w:val="left"/>
+      <w:pPr>
+        <w:tabs>
+          <w:tab w:val="num" w:pos="6480"/>
+        </w:tabs>
+        <w:ind w:left="6480" w:hanging="360"/>
+      </w:pPr>
+      <w:rPr>
+        <w:rFonts w:ascii="Wingdings" w:hAnsi="Wingdings" w:hint="default"/>
+        <w:sz w:val="20"/>
+      </w:rPr>
+    </w:lvl>
+  </w:abstractNum>
+  <w:abstractNum w:abstractNumId="5" w15:restartNumberingAfterBreak="0">
     <w:nsid w:val="15ED6A49"/>
     <w:multiLevelType w:val="multilevel"/>
     <w:tmpl w:val="763C5EC6"/>
@@ -1793,7 +4112,752 @@
       </w:rPr>
     </w:lvl>
   </w:abstractNum>
-  <w:abstractNum w:abstractNumId="2" w15:restartNumberingAfterBreak="0">
+  <w:abstractNum w:abstractNumId="6" w15:restartNumberingAfterBreak="0">
+    <w:nsid w:val="1B4F5C54"/>
+    <w:multiLevelType w:val="multilevel"/>
+    <w:tmpl w:val="8F5E7DD8"/>
+    <w:lvl w:ilvl="0">
+      <w:start w:val="1"/>
+      <w:numFmt w:val="bullet"/>
+      <w:lvlText w:val=""/>
+      <w:lvlJc w:val="left"/>
+      <w:pPr>
+        <w:tabs>
+          <w:tab w:val="num" w:pos="720"/>
+        </w:tabs>
+        <w:ind w:left="720" w:hanging="360"/>
+      </w:pPr>
+      <w:rPr>
+        <w:rFonts w:ascii="Symbol" w:hAnsi="Symbol" w:hint="default"/>
+        <w:sz w:val="20"/>
+      </w:rPr>
+    </w:lvl>
+    <w:lvl w:ilvl="1" w:tentative="1">
+      <w:start w:val="1"/>
+      <w:numFmt w:val="bullet"/>
+      <w:lvlText w:val="o"/>
+      <w:lvlJc w:val="left"/>
+      <w:pPr>
+        <w:tabs>
+          <w:tab w:val="num" w:pos="1440"/>
+        </w:tabs>
+        <w:ind w:left="1440" w:hanging="360"/>
+      </w:pPr>
+      <w:rPr>
+        <w:rFonts w:ascii="Courier New" w:hAnsi="Courier New" w:hint="default"/>
+        <w:sz w:val="20"/>
+      </w:rPr>
+    </w:lvl>
+    <w:lvl w:ilvl="2" w:tentative="1">
+      <w:start w:val="1"/>
+      <w:numFmt w:val="bullet"/>
+      <w:lvlText w:val=""/>
+      <w:lvlJc w:val="left"/>
+      <w:pPr>
+        <w:tabs>
+          <w:tab w:val="num" w:pos="2160"/>
+        </w:tabs>
+        <w:ind w:left="2160" w:hanging="360"/>
+      </w:pPr>
+      <w:rPr>
+        <w:rFonts w:ascii="Wingdings" w:hAnsi="Wingdings" w:hint="default"/>
+        <w:sz w:val="20"/>
+      </w:rPr>
+    </w:lvl>
+    <w:lvl w:ilvl="3" w:tentative="1">
+      <w:start w:val="1"/>
+      <w:numFmt w:val="bullet"/>
+      <w:lvlText w:val=""/>
+      <w:lvlJc w:val="left"/>
+      <w:pPr>
+        <w:tabs>
+          <w:tab w:val="num" w:pos="2880"/>
+        </w:tabs>
+        <w:ind w:left="2880" w:hanging="360"/>
+      </w:pPr>
+      <w:rPr>
+        <w:rFonts w:ascii="Wingdings" w:hAnsi="Wingdings" w:hint="default"/>
+        <w:sz w:val="20"/>
+      </w:rPr>
+    </w:lvl>
+    <w:lvl w:ilvl="4" w:tentative="1">
+      <w:start w:val="1"/>
+      <w:numFmt w:val="bullet"/>
+      <w:lvlText w:val=""/>
+      <w:lvlJc w:val="left"/>
+      <w:pPr>
+        <w:tabs>
+          <w:tab w:val="num" w:pos="3600"/>
+        </w:tabs>
+        <w:ind w:left="3600" w:hanging="360"/>
+      </w:pPr>
+      <w:rPr>
+        <w:rFonts w:ascii="Wingdings" w:hAnsi="Wingdings" w:hint="default"/>
+        <w:sz w:val="20"/>
+      </w:rPr>
+    </w:lvl>
+    <w:lvl w:ilvl="5" w:tentative="1">
+      <w:start w:val="1"/>
+      <w:numFmt w:val="bullet"/>
+      <w:lvlText w:val=""/>
+      <w:lvlJc w:val="left"/>
+      <w:pPr>
+        <w:tabs>
+          <w:tab w:val="num" w:pos="4320"/>
+        </w:tabs>
+        <w:ind w:left="4320" w:hanging="360"/>
+      </w:pPr>
+      <w:rPr>
+        <w:rFonts w:ascii="Wingdings" w:hAnsi="Wingdings" w:hint="default"/>
+        <w:sz w:val="20"/>
+      </w:rPr>
+    </w:lvl>
+    <w:lvl w:ilvl="6" w:tentative="1">
+      <w:start w:val="1"/>
+      <w:numFmt w:val="bullet"/>
+      <w:lvlText w:val=""/>
+      <w:lvlJc w:val="left"/>
+      <w:pPr>
+        <w:tabs>
+          <w:tab w:val="num" w:pos="5040"/>
+        </w:tabs>
+        <w:ind w:left="5040" w:hanging="360"/>
+      </w:pPr>
+      <w:rPr>
+        <w:rFonts w:ascii="Wingdings" w:hAnsi="Wingdings" w:hint="default"/>
+        <w:sz w:val="20"/>
+      </w:rPr>
+    </w:lvl>
+    <w:lvl w:ilvl="7" w:tentative="1">
+      <w:start w:val="1"/>
+      <w:numFmt w:val="bullet"/>
+      <w:lvlText w:val=""/>
+      <w:lvlJc w:val="left"/>
+      <w:pPr>
+        <w:tabs>
+          <w:tab w:val="num" w:pos="5760"/>
+        </w:tabs>
+        <w:ind w:left="5760" w:hanging="360"/>
+      </w:pPr>
+      <w:rPr>
+        <w:rFonts w:ascii="Wingdings" w:hAnsi="Wingdings" w:hint="default"/>
+        <w:sz w:val="20"/>
+      </w:rPr>
+    </w:lvl>
+    <w:lvl w:ilvl="8" w:tentative="1">
+      <w:start w:val="1"/>
+      <w:numFmt w:val="bullet"/>
+      <w:lvlText w:val=""/>
+      <w:lvlJc w:val="left"/>
+      <w:pPr>
+        <w:tabs>
+          <w:tab w:val="num" w:pos="6480"/>
+        </w:tabs>
+        <w:ind w:left="6480" w:hanging="360"/>
+      </w:pPr>
+      <w:rPr>
+        <w:rFonts w:ascii="Wingdings" w:hAnsi="Wingdings" w:hint="default"/>
+        <w:sz w:val="20"/>
+      </w:rPr>
+    </w:lvl>
+  </w:abstractNum>
+  <w:abstractNum w:abstractNumId="7" w15:restartNumberingAfterBreak="0">
+    <w:nsid w:val="285B6226"/>
+    <w:multiLevelType w:val="multilevel"/>
+    <w:tmpl w:val="0FF0E786"/>
+    <w:lvl w:ilvl="0">
+      <w:start w:val="1"/>
+      <w:numFmt w:val="bullet"/>
+      <w:lvlText w:val=""/>
+      <w:lvlJc w:val="left"/>
+      <w:pPr>
+        <w:tabs>
+          <w:tab w:val="num" w:pos="720"/>
+        </w:tabs>
+        <w:ind w:left="720" w:hanging="360"/>
+      </w:pPr>
+      <w:rPr>
+        <w:rFonts w:ascii="Symbol" w:hAnsi="Symbol" w:hint="default"/>
+        <w:sz w:val="20"/>
+      </w:rPr>
+    </w:lvl>
+    <w:lvl w:ilvl="1" w:tentative="1">
+      <w:start w:val="1"/>
+      <w:numFmt w:val="bullet"/>
+      <w:lvlText w:val="o"/>
+      <w:lvlJc w:val="left"/>
+      <w:pPr>
+        <w:tabs>
+          <w:tab w:val="num" w:pos="1440"/>
+        </w:tabs>
+        <w:ind w:left="1440" w:hanging="360"/>
+      </w:pPr>
+      <w:rPr>
+        <w:rFonts w:ascii="Courier New" w:hAnsi="Courier New" w:hint="default"/>
+        <w:sz w:val="20"/>
+      </w:rPr>
+    </w:lvl>
+    <w:lvl w:ilvl="2" w:tentative="1">
+      <w:start w:val="1"/>
+      <w:numFmt w:val="bullet"/>
+      <w:lvlText w:val=""/>
+      <w:lvlJc w:val="left"/>
+      <w:pPr>
+        <w:tabs>
+          <w:tab w:val="num" w:pos="2160"/>
+        </w:tabs>
+        <w:ind w:left="2160" w:hanging="360"/>
+      </w:pPr>
+      <w:rPr>
+        <w:rFonts w:ascii="Wingdings" w:hAnsi="Wingdings" w:hint="default"/>
+        <w:sz w:val="20"/>
+      </w:rPr>
+    </w:lvl>
+    <w:lvl w:ilvl="3" w:tentative="1">
+      <w:start w:val="1"/>
+      <w:numFmt w:val="bullet"/>
+      <w:lvlText w:val=""/>
+      <w:lvlJc w:val="left"/>
+      <w:pPr>
+        <w:tabs>
+          <w:tab w:val="num" w:pos="2880"/>
+        </w:tabs>
+        <w:ind w:left="2880" w:hanging="360"/>
+      </w:pPr>
+      <w:rPr>
+        <w:rFonts w:ascii="Wingdings" w:hAnsi="Wingdings" w:hint="default"/>
+        <w:sz w:val="20"/>
+      </w:rPr>
+    </w:lvl>
+    <w:lvl w:ilvl="4" w:tentative="1">
+      <w:start w:val="1"/>
+      <w:numFmt w:val="bullet"/>
+      <w:lvlText w:val=""/>
+      <w:lvlJc w:val="left"/>
+      <w:pPr>
+        <w:tabs>
+          <w:tab w:val="num" w:pos="3600"/>
+        </w:tabs>
+        <w:ind w:left="3600" w:hanging="360"/>
+      </w:pPr>
+      <w:rPr>
+        <w:rFonts w:ascii="Wingdings" w:hAnsi="Wingdings" w:hint="default"/>
+        <w:sz w:val="20"/>
+      </w:rPr>
+    </w:lvl>
+    <w:lvl w:ilvl="5" w:tentative="1">
+      <w:start w:val="1"/>
+      <w:numFmt w:val="bullet"/>
+      <w:lvlText w:val=""/>
+      <w:lvlJc w:val="left"/>
+      <w:pPr>
+        <w:tabs>
+          <w:tab w:val="num" w:pos="4320"/>
+        </w:tabs>
+        <w:ind w:left="4320" w:hanging="360"/>
+      </w:pPr>
+      <w:rPr>
+        <w:rFonts w:ascii="Wingdings" w:hAnsi="Wingdings" w:hint="default"/>
+        <w:sz w:val="20"/>
+      </w:rPr>
+    </w:lvl>
+    <w:lvl w:ilvl="6" w:tentative="1">
+      <w:start w:val="1"/>
+      <w:numFmt w:val="bullet"/>
+      <w:lvlText w:val=""/>
+      <w:lvlJc w:val="left"/>
+      <w:pPr>
+        <w:tabs>
+          <w:tab w:val="num" w:pos="5040"/>
+        </w:tabs>
+        <w:ind w:left="5040" w:hanging="360"/>
+      </w:pPr>
+      <w:rPr>
+        <w:rFonts w:ascii="Wingdings" w:hAnsi="Wingdings" w:hint="default"/>
+        <w:sz w:val="20"/>
+      </w:rPr>
+    </w:lvl>
+    <w:lvl w:ilvl="7" w:tentative="1">
+      <w:start w:val="1"/>
+      <w:numFmt w:val="bullet"/>
+      <w:lvlText w:val=""/>
+      <w:lvlJc w:val="left"/>
+      <w:pPr>
+        <w:tabs>
+          <w:tab w:val="num" w:pos="5760"/>
+        </w:tabs>
+        <w:ind w:left="5760" w:hanging="360"/>
+      </w:pPr>
+      <w:rPr>
+        <w:rFonts w:ascii="Wingdings" w:hAnsi="Wingdings" w:hint="default"/>
+        <w:sz w:val="20"/>
+      </w:rPr>
+    </w:lvl>
+    <w:lvl w:ilvl="8" w:tentative="1">
+      <w:start w:val="1"/>
+      <w:numFmt w:val="bullet"/>
+      <w:lvlText w:val=""/>
+      <w:lvlJc w:val="left"/>
+      <w:pPr>
+        <w:tabs>
+          <w:tab w:val="num" w:pos="6480"/>
+        </w:tabs>
+        <w:ind w:left="6480" w:hanging="360"/>
+      </w:pPr>
+      <w:rPr>
+        <w:rFonts w:ascii="Wingdings" w:hAnsi="Wingdings" w:hint="default"/>
+        <w:sz w:val="20"/>
+      </w:rPr>
+    </w:lvl>
+  </w:abstractNum>
+  <w:abstractNum w:abstractNumId="8" w15:restartNumberingAfterBreak="0">
+    <w:nsid w:val="2F9F2CA0"/>
+    <w:multiLevelType w:val="multilevel"/>
+    <w:tmpl w:val="5F34A74C"/>
+    <w:lvl w:ilvl="0">
+      <w:start w:val="1"/>
+      <w:numFmt w:val="bullet"/>
+      <w:lvlText w:val=""/>
+      <w:lvlJc w:val="left"/>
+      <w:pPr>
+        <w:tabs>
+          <w:tab w:val="num" w:pos="720"/>
+        </w:tabs>
+        <w:ind w:left="720" w:hanging="360"/>
+      </w:pPr>
+      <w:rPr>
+        <w:rFonts w:ascii="Symbol" w:hAnsi="Symbol" w:hint="default"/>
+        <w:sz w:val="20"/>
+      </w:rPr>
+    </w:lvl>
+    <w:lvl w:ilvl="1" w:tentative="1">
+      <w:start w:val="1"/>
+      <w:numFmt w:val="bullet"/>
+      <w:lvlText w:val="o"/>
+      <w:lvlJc w:val="left"/>
+      <w:pPr>
+        <w:tabs>
+          <w:tab w:val="num" w:pos="1440"/>
+        </w:tabs>
+        <w:ind w:left="1440" w:hanging="360"/>
+      </w:pPr>
+      <w:rPr>
+        <w:rFonts w:ascii="Courier New" w:hAnsi="Courier New" w:hint="default"/>
+        <w:sz w:val="20"/>
+      </w:rPr>
+    </w:lvl>
+    <w:lvl w:ilvl="2" w:tentative="1">
+      <w:start w:val="1"/>
+      <w:numFmt w:val="bullet"/>
+      <w:lvlText w:val=""/>
+      <w:lvlJc w:val="left"/>
+      <w:pPr>
+        <w:tabs>
+          <w:tab w:val="num" w:pos="2160"/>
+        </w:tabs>
+        <w:ind w:left="2160" w:hanging="360"/>
+      </w:pPr>
+      <w:rPr>
+        <w:rFonts w:ascii="Wingdings" w:hAnsi="Wingdings" w:hint="default"/>
+        <w:sz w:val="20"/>
+      </w:rPr>
+    </w:lvl>
+    <w:lvl w:ilvl="3" w:tentative="1">
+      <w:start w:val="1"/>
+      <w:numFmt w:val="bullet"/>
+      <w:lvlText w:val=""/>
+      <w:lvlJc w:val="left"/>
+      <w:pPr>
+        <w:tabs>
+          <w:tab w:val="num" w:pos="2880"/>
+        </w:tabs>
+        <w:ind w:left="2880" w:hanging="360"/>
+      </w:pPr>
+      <w:rPr>
+        <w:rFonts w:ascii="Wingdings" w:hAnsi="Wingdings" w:hint="default"/>
+        <w:sz w:val="20"/>
+      </w:rPr>
+    </w:lvl>
+    <w:lvl w:ilvl="4" w:tentative="1">
+      <w:start w:val="1"/>
+      <w:numFmt w:val="bullet"/>
+      <w:lvlText w:val=""/>
+      <w:lvlJc w:val="left"/>
+      <w:pPr>
+        <w:tabs>
+          <w:tab w:val="num" w:pos="3600"/>
+        </w:tabs>
+        <w:ind w:left="3600" w:hanging="360"/>
+      </w:pPr>
+      <w:rPr>
+        <w:rFonts w:ascii="Wingdings" w:hAnsi="Wingdings" w:hint="default"/>
+        <w:sz w:val="20"/>
+      </w:rPr>
+    </w:lvl>
+    <w:lvl w:ilvl="5" w:tentative="1">
+      <w:start w:val="1"/>
+      <w:numFmt w:val="bullet"/>
+      <w:lvlText w:val=""/>
+      <w:lvlJc w:val="left"/>
+      <w:pPr>
+        <w:tabs>
+          <w:tab w:val="num" w:pos="4320"/>
+        </w:tabs>
+        <w:ind w:left="4320" w:hanging="360"/>
+      </w:pPr>
+      <w:rPr>
+        <w:rFonts w:ascii="Wingdings" w:hAnsi="Wingdings" w:hint="default"/>
+        <w:sz w:val="20"/>
+      </w:rPr>
+    </w:lvl>
+    <w:lvl w:ilvl="6" w:tentative="1">
+      <w:start w:val="1"/>
+      <w:numFmt w:val="bullet"/>
+      <w:lvlText w:val=""/>
+      <w:lvlJc w:val="left"/>
+      <w:pPr>
+        <w:tabs>
+          <w:tab w:val="num" w:pos="5040"/>
+        </w:tabs>
+        <w:ind w:left="5040" w:hanging="360"/>
+      </w:pPr>
+      <w:rPr>
+        <w:rFonts w:ascii="Wingdings" w:hAnsi="Wingdings" w:hint="default"/>
+        <w:sz w:val="20"/>
+      </w:rPr>
+    </w:lvl>
+    <w:lvl w:ilvl="7" w:tentative="1">
+      <w:start w:val="1"/>
+      <w:numFmt w:val="bullet"/>
+      <w:lvlText w:val=""/>
+      <w:lvlJc w:val="left"/>
+      <w:pPr>
+        <w:tabs>
+          <w:tab w:val="num" w:pos="5760"/>
+        </w:tabs>
+        <w:ind w:left="5760" w:hanging="360"/>
+      </w:pPr>
+      <w:rPr>
+        <w:rFonts w:ascii="Wingdings" w:hAnsi="Wingdings" w:hint="default"/>
+        <w:sz w:val="20"/>
+      </w:rPr>
+    </w:lvl>
+    <w:lvl w:ilvl="8" w:tentative="1">
+      <w:start w:val="1"/>
+      <w:numFmt w:val="bullet"/>
+      <w:lvlText w:val=""/>
+      <w:lvlJc w:val="left"/>
+      <w:pPr>
+        <w:tabs>
+          <w:tab w:val="num" w:pos="6480"/>
+        </w:tabs>
+        <w:ind w:left="6480" w:hanging="360"/>
+      </w:pPr>
+      <w:rPr>
+        <w:rFonts w:ascii="Wingdings" w:hAnsi="Wingdings" w:hint="default"/>
+        <w:sz w:val="20"/>
+      </w:rPr>
+    </w:lvl>
+  </w:abstractNum>
+  <w:abstractNum w:abstractNumId="9" w15:restartNumberingAfterBreak="0">
+    <w:nsid w:val="379D42EC"/>
+    <w:multiLevelType w:val="multilevel"/>
+    <w:tmpl w:val="3FA29746"/>
+    <w:lvl w:ilvl="0">
+      <w:start w:val="1"/>
+      <w:numFmt w:val="bullet"/>
+      <w:lvlText w:val=""/>
+      <w:lvlJc w:val="left"/>
+      <w:pPr>
+        <w:tabs>
+          <w:tab w:val="num" w:pos="720"/>
+        </w:tabs>
+        <w:ind w:left="720" w:hanging="360"/>
+      </w:pPr>
+      <w:rPr>
+        <w:rFonts w:ascii="Symbol" w:hAnsi="Symbol" w:hint="default"/>
+        <w:sz w:val="20"/>
+      </w:rPr>
+    </w:lvl>
+    <w:lvl w:ilvl="1" w:tentative="1">
+      <w:start w:val="1"/>
+      <w:numFmt w:val="bullet"/>
+      <w:lvlText w:val="o"/>
+      <w:lvlJc w:val="left"/>
+      <w:pPr>
+        <w:tabs>
+          <w:tab w:val="num" w:pos="1440"/>
+        </w:tabs>
+        <w:ind w:left="1440" w:hanging="360"/>
+      </w:pPr>
+      <w:rPr>
+        <w:rFonts w:ascii="Courier New" w:hAnsi="Courier New" w:hint="default"/>
+        <w:sz w:val="20"/>
+      </w:rPr>
+    </w:lvl>
+    <w:lvl w:ilvl="2" w:tentative="1">
+      <w:start w:val="1"/>
+      <w:numFmt w:val="bullet"/>
+      <w:lvlText w:val=""/>
+      <w:lvlJc w:val="left"/>
+      <w:pPr>
+        <w:tabs>
+          <w:tab w:val="num" w:pos="2160"/>
+        </w:tabs>
+        <w:ind w:left="2160" w:hanging="360"/>
+      </w:pPr>
+      <w:rPr>
+        <w:rFonts w:ascii="Wingdings" w:hAnsi="Wingdings" w:hint="default"/>
+        <w:sz w:val="20"/>
+      </w:rPr>
+    </w:lvl>
+    <w:lvl w:ilvl="3" w:tentative="1">
+      <w:start w:val="1"/>
+      <w:numFmt w:val="bullet"/>
+      <w:lvlText w:val=""/>
+      <w:lvlJc w:val="left"/>
+      <w:pPr>
+        <w:tabs>
+          <w:tab w:val="num" w:pos="2880"/>
+        </w:tabs>
+        <w:ind w:left="2880" w:hanging="360"/>
+      </w:pPr>
+      <w:rPr>
+        <w:rFonts w:ascii="Wingdings" w:hAnsi="Wingdings" w:hint="default"/>
+        <w:sz w:val="20"/>
+      </w:rPr>
+    </w:lvl>
+    <w:lvl w:ilvl="4" w:tentative="1">
+      <w:start w:val="1"/>
+      <w:numFmt w:val="bullet"/>
+      <w:lvlText w:val=""/>
+      <w:lvlJc w:val="left"/>
+      <w:pPr>
+        <w:tabs>
+          <w:tab w:val="num" w:pos="3600"/>
+        </w:tabs>
+        <w:ind w:left="3600" w:hanging="360"/>
+      </w:pPr>
+      <w:rPr>
+        <w:rFonts w:ascii="Wingdings" w:hAnsi="Wingdings" w:hint="default"/>
+        <w:sz w:val="20"/>
+      </w:rPr>
+    </w:lvl>
+    <w:lvl w:ilvl="5" w:tentative="1">
+      <w:start w:val="1"/>
+      <w:numFmt w:val="bullet"/>
+      <w:lvlText w:val=""/>
+      <w:lvlJc w:val="left"/>
+      <w:pPr>
+        <w:tabs>
+          <w:tab w:val="num" w:pos="4320"/>
+        </w:tabs>
+        <w:ind w:left="4320" w:hanging="360"/>
+      </w:pPr>
+      <w:rPr>
+        <w:rFonts w:ascii="Wingdings" w:hAnsi="Wingdings" w:hint="default"/>
+        <w:sz w:val="20"/>
+      </w:rPr>
+    </w:lvl>
+    <w:lvl w:ilvl="6" w:tentative="1">
+      <w:start w:val="1"/>
+      <w:numFmt w:val="bullet"/>
+      <w:lvlText w:val=""/>
+      <w:lvlJc w:val="left"/>
+      <w:pPr>
+        <w:tabs>
+          <w:tab w:val="num" w:pos="5040"/>
+        </w:tabs>
+        <w:ind w:left="5040" w:hanging="360"/>
+      </w:pPr>
+      <w:rPr>
+        <w:rFonts w:ascii="Wingdings" w:hAnsi="Wingdings" w:hint="default"/>
+        <w:sz w:val="20"/>
+      </w:rPr>
+    </w:lvl>
+    <w:lvl w:ilvl="7" w:tentative="1">
+      <w:start w:val="1"/>
+      <w:numFmt w:val="bullet"/>
+      <w:lvlText w:val=""/>
+      <w:lvlJc w:val="left"/>
+      <w:pPr>
+        <w:tabs>
+          <w:tab w:val="num" w:pos="5760"/>
+        </w:tabs>
+        <w:ind w:left="5760" w:hanging="360"/>
+      </w:pPr>
+      <w:rPr>
+        <w:rFonts w:ascii="Wingdings" w:hAnsi="Wingdings" w:hint="default"/>
+        <w:sz w:val="20"/>
+      </w:rPr>
+    </w:lvl>
+    <w:lvl w:ilvl="8" w:tentative="1">
+      <w:start w:val="1"/>
+      <w:numFmt w:val="bullet"/>
+      <w:lvlText w:val=""/>
+      <w:lvlJc w:val="left"/>
+      <w:pPr>
+        <w:tabs>
+          <w:tab w:val="num" w:pos="6480"/>
+        </w:tabs>
+        <w:ind w:left="6480" w:hanging="360"/>
+      </w:pPr>
+      <w:rPr>
+        <w:rFonts w:ascii="Wingdings" w:hAnsi="Wingdings" w:hint="default"/>
+        <w:sz w:val="20"/>
+      </w:rPr>
+    </w:lvl>
+  </w:abstractNum>
+  <w:abstractNum w:abstractNumId="10" w15:restartNumberingAfterBreak="0">
+    <w:nsid w:val="43C81931"/>
+    <w:multiLevelType w:val="multilevel"/>
+    <w:tmpl w:val="1F7AE128"/>
+    <w:lvl w:ilvl="0">
+      <w:start w:val="1"/>
+      <w:numFmt w:val="bullet"/>
+      <w:lvlText w:val=""/>
+      <w:lvlJc w:val="left"/>
+      <w:pPr>
+        <w:tabs>
+          <w:tab w:val="num" w:pos="720"/>
+        </w:tabs>
+        <w:ind w:left="720" w:hanging="360"/>
+      </w:pPr>
+      <w:rPr>
+        <w:rFonts w:ascii="Symbol" w:hAnsi="Symbol" w:hint="default"/>
+        <w:sz w:val="20"/>
+      </w:rPr>
+    </w:lvl>
+    <w:lvl w:ilvl="1" w:tentative="1">
+      <w:start w:val="1"/>
+      <w:numFmt w:val="bullet"/>
+      <w:lvlText w:val="o"/>
+      <w:lvlJc w:val="left"/>
+      <w:pPr>
+        <w:tabs>
+          <w:tab w:val="num" w:pos="1440"/>
+        </w:tabs>
+        <w:ind w:left="1440" w:hanging="360"/>
+      </w:pPr>
+      <w:rPr>
+        <w:rFonts w:ascii="Courier New" w:hAnsi="Courier New" w:hint="default"/>
+        <w:sz w:val="20"/>
+      </w:rPr>
+    </w:lvl>
+    <w:lvl w:ilvl="2" w:tentative="1">
+      <w:start w:val="1"/>
+      <w:numFmt w:val="bullet"/>
+      <w:lvlText w:val=""/>
+      <w:lvlJc w:val="left"/>
+      <w:pPr>
+        <w:tabs>
+          <w:tab w:val="num" w:pos="2160"/>
+        </w:tabs>
+        <w:ind w:left="2160" w:hanging="360"/>
+      </w:pPr>
+      <w:rPr>
+        <w:rFonts w:ascii="Wingdings" w:hAnsi="Wingdings" w:hint="default"/>
+        <w:sz w:val="20"/>
+      </w:rPr>
+    </w:lvl>
+    <w:lvl w:ilvl="3" w:tentative="1">
+      <w:start w:val="1"/>
+      <w:numFmt w:val="bullet"/>
+      <w:lvlText w:val=""/>
+      <w:lvlJc w:val="left"/>
+      <w:pPr>
+        <w:tabs>
+          <w:tab w:val="num" w:pos="2880"/>
+        </w:tabs>
+        <w:ind w:left="2880" w:hanging="360"/>
+      </w:pPr>
+      <w:rPr>
+        <w:rFonts w:ascii="Wingdings" w:hAnsi="Wingdings" w:hint="default"/>
+        <w:sz w:val="20"/>
+      </w:rPr>
+    </w:lvl>
+    <w:lvl w:ilvl="4" w:tentative="1">
+      <w:start w:val="1"/>
+      <w:numFmt w:val="bullet"/>
+      <w:lvlText w:val=""/>
+      <w:lvlJc w:val="left"/>
+      <w:pPr>
+        <w:tabs>
+          <w:tab w:val="num" w:pos="3600"/>
+        </w:tabs>
+        <w:ind w:left="3600" w:hanging="360"/>
+      </w:pPr>
+      <w:rPr>
+        <w:rFonts w:ascii="Wingdings" w:hAnsi="Wingdings" w:hint="default"/>
+        <w:sz w:val="20"/>
+      </w:rPr>
+    </w:lvl>
+    <w:lvl w:ilvl="5" w:tentative="1">
+      <w:start w:val="1"/>
+      <w:numFmt w:val="bullet"/>
+      <w:lvlText w:val=""/>
+      <w:lvlJc w:val="left"/>
+      <w:pPr>
+        <w:tabs>
+          <w:tab w:val="num" w:pos="4320"/>
+        </w:tabs>
+        <w:ind w:left="4320" w:hanging="360"/>
+      </w:pPr>
+      <w:rPr>
+        <w:rFonts w:ascii="Wingdings" w:hAnsi="Wingdings" w:hint="default"/>
+        <w:sz w:val="20"/>
+      </w:rPr>
+    </w:lvl>
+    <w:lvl w:ilvl="6" w:tentative="1">
+      <w:start w:val="1"/>
+      <w:numFmt w:val="bullet"/>
+      <w:lvlText w:val=""/>
+      <w:lvlJc w:val="left"/>
+      <w:pPr>
+        <w:tabs>
+          <w:tab w:val="num" w:pos="5040"/>
+        </w:tabs>
+        <w:ind w:left="5040" w:hanging="360"/>
+      </w:pPr>
+      <w:rPr>
+        <w:rFonts w:ascii="Wingdings" w:hAnsi="Wingdings" w:hint="default"/>
+        <w:sz w:val="20"/>
+      </w:rPr>
+    </w:lvl>
+    <w:lvl w:ilvl="7" w:tentative="1">
+      <w:start w:val="1"/>
+      <w:numFmt w:val="bullet"/>
+      <w:lvlText w:val=""/>
+      <w:lvlJc w:val="left"/>
+      <w:pPr>
+        <w:tabs>
+          <w:tab w:val="num" w:pos="5760"/>
+        </w:tabs>
+        <w:ind w:left="5760" w:hanging="360"/>
+      </w:pPr>
+      <w:rPr>
+        <w:rFonts w:ascii="Wingdings" w:hAnsi="Wingdings" w:hint="default"/>
+        <w:sz w:val="20"/>
+      </w:rPr>
+    </w:lvl>
+    <w:lvl w:ilvl="8" w:tentative="1">
+      <w:start w:val="1"/>
+      <w:numFmt w:val="bullet"/>
+      <w:lvlText w:val=""/>
+      <w:lvlJc w:val="left"/>
+      <w:pPr>
+        <w:tabs>
+          <w:tab w:val="num" w:pos="6480"/>
+        </w:tabs>
+        <w:ind w:left="6480" w:hanging="360"/>
+      </w:pPr>
+      <w:rPr>
+        <w:rFonts w:ascii="Wingdings" w:hAnsi="Wingdings" w:hint="default"/>
+        <w:sz w:val="20"/>
+      </w:rPr>
+    </w:lvl>
+  </w:abstractNum>
+  <w:abstractNum w:abstractNumId="11" w15:restartNumberingAfterBreak="0">
     <w:nsid w:val="4446061F"/>
     <w:multiLevelType w:val="multilevel"/>
     <w:tmpl w:val="15DC1518"/>
@@ -1942,7 +5006,901 @@
       </w:rPr>
     </w:lvl>
   </w:abstractNum>
-  <w:abstractNum w:abstractNumId="3" w15:restartNumberingAfterBreak="0">
+  <w:abstractNum w:abstractNumId="12" w15:restartNumberingAfterBreak="0">
+    <w:nsid w:val="4B4C6B95"/>
+    <w:multiLevelType w:val="multilevel"/>
+    <w:tmpl w:val="1C72C87C"/>
+    <w:lvl w:ilvl="0">
+      <w:start w:val="1"/>
+      <w:numFmt w:val="bullet"/>
+      <w:lvlText w:val=""/>
+      <w:lvlJc w:val="left"/>
+      <w:pPr>
+        <w:tabs>
+          <w:tab w:val="num" w:pos="720"/>
+        </w:tabs>
+        <w:ind w:left="720" w:hanging="360"/>
+      </w:pPr>
+      <w:rPr>
+        <w:rFonts w:ascii="Symbol" w:hAnsi="Symbol" w:hint="default"/>
+        <w:sz w:val="20"/>
+      </w:rPr>
+    </w:lvl>
+    <w:lvl w:ilvl="1" w:tentative="1">
+      <w:start w:val="1"/>
+      <w:numFmt w:val="bullet"/>
+      <w:lvlText w:val="o"/>
+      <w:lvlJc w:val="left"/>
+      <w:pPr>
+        <w:tabs>
+          <w:tab w:val="num" w:pos="1440"/>
+        </w:tabs>
+        <w:ind w:left="1440" w:hanging="360"/>
+      </w:pPr>
+      <w:rPr>
+        <w:rFonts w:ascii="Courier New" w:hAnsi="Courier New" w:hint="default"/>
+        <w:sz w:val="20"/>
+      </w:rPr>
+    </w:lvl>
+    <w:lvl w:ilvl="2" w:tentative="1">
+      <w:start w:val="1"/>
+      <w:numFmt w:val="bullet"/>
+      <w:lvlText w:val=""/>
+      <w:lvlJc w:val="left"/>
+      <w:pPr>
+        <w:tabs>
+          <w:tab w:val="num" w:pos="2160"/>
+        </w:tabs>
+        <w:ind w:left="2160" w:hanging="360"/>
+      </w:pPr>
+      <w:rPr>
+        <w:rFonts w:ascii="Wingdings" w:hAnsi="Wingdings" w:hint="default"/>
+        <w:sz w:val="20"/>
+      </w:rPr>
+    </w:lvl>
+    <w:lvl w:ilvl="3" w:tentative="1">
+      <w:start w:val="1"/>
+      <w:numFmt w:val="bullet"/>
+      <w:lvlText w:val=""/>
+      <w:lvlJc w:val="left"/>
+      <w:pPr>
+        <w:tabs>
+          <w:tab w:val="num" w:pos="2880"/>
+        </w:tabs>
+        <w:ind w:left="2880" w:hanging="360"/>
+      </w:pPr>
+      <w:rPr>
+        <w:rFonts w:ascii="Wingdings" w:hAnsi="Wingdings" w:hint="default"/>
+        <w:sz w:val="20"/>
+      </w:rPr>
+    </w:lvl>
+    <w:lvl w:ilvl="4" w:tentative="1">
+      <w:start w:val="1"/>
+      <w:numFmt w:val="bullet"/>
+      <w:lvlText w:val=""/>
+      <w:lvlJc w:val="left"/>
+      <w:pPr>
+        <w:tabs>
+          <w:tab w:val="num" w:pos="3600"/>
+        </w:tabs>
+        <w:ind w:left="3600" w:hanging="360"/>
+      </w:pPr>
+      <w:rPr>
+        <w:rFonts w:ascii="Wingdings" w:hAnsi="Wingdings" w:hint="default"/>
+        <w:sz w:val="20"/>
+      </w:rPr>
+    </w:lvl>
+    <w:lvl w:ilvl="5" w:tentative="1">
+      <w:start w:val="1"/>
+      <w:numFmt w:val="bullet"/>
+      <w:lvlText w:val=""/>
+      <w:lvlJc w:val="left"/>
+      <w:pPr>
+        <w:tabs>
+          <w:tab w:val="num" w:pos="4320"/>
+        </w:tabs>
+        <w:ind w:left="4320" w:hanging="360"/>
+      </w:pPr>
+      <w:rPr>
+        <w:rFonts w:ascii="Wingdings" w:hAnsi="Wingdings" w:hint="default"/>
+        <w:sz w:val="20"/>
+      </w:rPr>
+    </w:lvl>
+    <w:lvl w:ilvl="6" w:tentative="1">
+      <w:start w:val="1"/>
+      <w:numFmt w:val="bullet"/>
+      <w:lvlText w:val=""/>
+      <w:lvlJc w:val="left"/>
+      <w:pPr>
+        <w:tabs>
+          <w:tab w:val="num" w:pos="5040"/>
+        </w:tabs>
+        <w:ind w:left="5040" w:hanging="360"/>
+      </w:pPr>
+      <w:rPr>
+        <w:rFonts w:ascii="Wingdings" w:hAnsi="Wingdings" w:hint="default"/>
+        <w:sz w:val="20"/>
+      </w:rPr>
+    </w:lvl>
+    <w:lvl w:ilvl="7" w:tentative="1">
+      <w:start w:val="1"/>
+      <w:numFmt w:val="bullet"/>
+      <w:lvlText w:val=""/>
+      <w:lvlJc w:val="left"/>
+      <w:pPr>
+        <w:tabs>
+          <w:tab w:val="num" w:pos="5760"/>
+        </w:tabs>
+        <w:ind w:left="5760" w:hanging="360"/>
+      </w:pPr>
+      <w:rPr>
+        <w:rFonts w:ascii="Wingdings" w:hAnsi="Wingdings" w:hint="default"/>
+        <w:sz w:val="20"/>
+      </w:rPr>
+    </w:lvl>
+    <w:lvl w:ilvl="8" w:tentative="1">
+      <w:start w:val="1"/>
+      <w:numFmt w:val="bullet"/>
+      <w:lvlText w:val=""/>
+      <w:lvlJc w:val="left"/>
+      <w:pPr>
+        <w:tabs>
+          <w:tab w:val="num" w:pos="6480"/>
+        </w:tabs>
+        <w:ind w:left="6480" w:hanging="360"/>
+      </w:pPr>
+      <w:rPr>
+        <w:rFonts w:ascii="Wingdings" w:hAnsi="Wingdings" w:hint="default"/>
+        <w:sz w:val="20"/>
+      </w:rPr>
+    </w:lvl>
+  </w:abstractNum>
+  <w:abstractNum w:abstractNumId="13" w15:restartNumberingAfterBreak="0">
+    <w:nsid w:val="4C202CF1"/>
+    <w:multiLevelType w:val="multilevel"/>
+    <w:tmpl w:val="8C18DF42"/>
+    <w:lvl w:ilvl="0">
+      <w:start w:val="1"/>
+      <w:numFmt w:val="bullet"/>
+      <w:lvlText w:val=""/>
+      <w:lvlJc w:val="left"/>
+      <w:pPr>
+        <w:tabs>
+          <w:tab w:val="num" w:pos="720"/>
+        </w:tabs>
+        <w:ind w:left="720" w:hanging="360"/>
+      </w:pPr>
+      <w:rPr>
+        <w:rFonts w:ascii="Symbol" w:hAnsi="Symbol" w:hint="default"/>
+        <w:sz w:val="20"/>
+      </w:rPr>
+    </w:lvl>
+    <w:lvl w:ilvl="1" w:tentative="1">
+      <w:start w:val="1"/>
+      <w:numFmt w:val="bullet"/>
+      <w:lvlText w:val="o"/>
+      <w:lvlJc w:val="left"/>
+      <w:pPr>
+        <w:tabs>
+          <w:tab w:val="num" w:pos="1440"/>
+        </w:tabs>
+        <w:ind w:left="1440" w:hanging="360"/>
+      </w:pPr>
+      <w:rPr>
+        <w:rFonts w:ascii="Courier New" w:hAnsi="Courier New" w:hint="default"/>
+        <w:sz w:val="20"/>
+      </w:rPr>
+    </w:lvl>
+    <w:lvl w:ilvl="2" w:tentative="1">
+      <w:start w:val="1"/>
+      <w:numFmt w:val="bullet"/>
+      <w:lvlText w:val=""/>
+      <w:lvlJc w:val="left"/>
+      <w:pPr>
+        <w:tabs>
+          <w:tab w:val="num" w:pos="2160"/>
+        </w:tabs>
+        <w:ind w:left="2160" w:hanging="360"/>
+      </w:pPr>
+      <w:rPr>
+        <w:rFonts w:ascii="Wingdings" w:hAnsi="Wingdings" w:hint="default"/>
+        <w:sz w:val="20"/>
+      </w:rPr>
+    </w:lvl>
+    <w:lvl w:ilvl="3" w:tentative="1">
+      <w:start w:val="1"/>
+      <w:numFmt w:val="bullet"/>
+      <w:lvlText w:val=""/>
+      <w:lvlJc w:val="left"/>
+      <w:pPr>
+        <w:tabs>
+          <w:tab w:val="num" w:pos="2880"/>
+        </w:tabs>
+        <w:ind w:left="2880" w:hanging="360"/>
+      </w:pPr>
+      <w:rPr>
+        <w:rFonts w:ascii="Wingdings" w:hAnsi="Wingdings" w:hint="default"/>
+        <w:sz w:val="20"/>
+      </w:rPr>
+    </w:lvl>
+    <w:lvl w:ilvl="4" w:tentative="1">
+      <w:start w:val="1"/>
+      <w:numFmt w:val="bullet"/>
+      <w:lvlText w:val=""/>
+      <w:lvlJc w:val="left"/>
+      <w:pPr>
+        <w:tabs>
+          <w:tab w:val="num" w:pos="3600"/>
+        </w:tabs>
+        <w:ind w:left="3600" w:hanging="360"/>
+      </w:pPr>
+      <w:rPr>
+        <w:rFonts w:ascii="Wingdings" w:hAnsi="Wingdings" w:hint="default"/>
+        <w:sz w:val="20"/>
+      </w:rPr>
+    </w:lvl>
+    <w:lvl w:ilvl="5" w:tentative="1">
+      <w:start w:val="1"/>
+      <w:numFmt w:val="bullet"/>
+      <w:lvlText w:val=""/>
+      <w:lvlJc w:val="left"/>
+      <w:pPr>
+        <w:tabs>
+          <w:tab w:val="num" w:pos="4320"/>
+        </w:tabs>
+        <w:ind w:left="4320" w:hanging="360"/>
+      </w:pPr>
+      <w:rPr>
+        <w:rFonts w:ascii="Wingdings" w:hAnsi="Wingdings" w:hint="default"/>
+        <w:sz w:val="20"/>
+      </w:rPr>
+    </w:lvl>
+    <w:lvl w:ilvl="6" w:tentative="1">
+      <w:start w:val="1"/>
+      <w:numFmt w:val="bullet"/>
+      <w:lvlText w:val=""/>
+      <w:lvlJc w:val="left"/>
+      <w:pPr>
+        <w:tabs>
+          <w:tab w:val="num" w:pos="5040"/>
+        </w:tabs>
+        <w:ind w:left="5040" w:hanging="360"/>
+      </w:pPr>
+      <w:rPr>
+        <w:rFonts w:ascii="Wingdings" w:hAnsi="Wingdings" w:hint="default"/>
+        <w:sz w:val="20"/>
+      </w:rPr>
+    </w:lvl>
+    <w:lvl w:ilvl="7" w:tentative="1">
+      <w:start w:val="1"/>
+      <w:numFmt w:val="bullet"/>
+      <w:lvlText w:val=""/>
+      <w:lvlJc w:val="left"/>
+      <w:pPr>
+        <w:tabs>
+          <w:tab w:val="num" w:pos="5760"/>
+        </w:tabs>
+        <w:ind w:left="5760" w:hanging="360"/>
+      </w:pPr>
+      <w:rPr>
+        <w:rFonts w:ascii="Wingdings" w:hAnsi="Wingdings" w:hint="default"/>
+        <w:sz w:val="20"/>
+      </w:rPr>
+    </w:lvl>
+    <w:lvl w:ilvl="8" w:tentative="1">
+      <w:start w:val="1"/>
+      <w:numFmt w:val="bullet"/>
+      <w:lvlText w:val=""/>
+      <w:lvlJc w:val="left"/>
+      <w:pPr>
+        <w:tabs>
+          <w:tab w:val="num" w:pos="6480"/>
+        </w:tabs>
+        <w:ind w:left="6480" w:hanging="360"/>
+      </w:pPr>
+      <w:rPr>
+        <w:rFonts w:ascii="Wingdings" w:hAnsi="Wingdings" w:hint="default"/>
+        <w:sz w:val="20"/>
+      </w:rPr>
+    </w:lvl>
+  </w:abstractNum>
+  <w:abstractNum w:abstractNumId="14" w15:restartNumberingAfterBreak="0">
+    <w:nsid w:val="4F8E4A1D"/>
+    <w:multiLevelType w:val="multilevel"/>
+    <w:tmpl w:val="E550ED00"/>
+    <w:lvl w:ilvl="0">
+      <w:start w:val="1"/>
+      <w:numFmt w:val="bullet"/>
+      <w:lvlText w:val=""/>
+      <w:lvlJc w:val="left"/>
+      <w:pPr>
+        <w:tabs>
+          <w:tab w:val="num" w:pos="720"/>
+        </w:tabs>
+        <w:ind w:left="720" w:hanging="360"/>
+      </w:pPr>
+      <w:rPr>
+        <w:rFonts w:ascii="Symbol" w:hAnsi="Symbol" w:hint="default"/>
+        <w:sz w:val="20"/>
+      </w:rPr>
+    </w:lvl>
+    <w:lvl w:ilvl="1" w:tentative="1">
+      <w:start w:val="1"/>
+      <w:numFmt w:val="bullet"/>
+      <w:lvlText w:val="o"/>
+      <w:lvlJc w:val="left"/>
+      <w:pPr>
+        <w:tabs>
+          <w:tab w:val="num" w:pos="1440"/>
+        </w:tabs>
+        <w:ind w:left="1440" w:hanging="360"/>
+      </w:pPr>
+      <w:rPr>
+        <w:rFonts w:ascii="Courier New" w:hAnsi="Courier New" w:hint="default"/>
+        <w:sz w:val="20"/>
+      </w:rPr>
+    </w:lvl>
+    <w:lvl w:ilvl="2" w:tentative="1">
+      <w:start w:val="1"/>
+      <w:numFmt w:val="bullet"/>
+      <w:lvlText w:val=""/>
+      <w:lvlJc w:val="left"/>
+      <w:pPr>
+        <w:tabs>
+          <w:tab w:val="num" w:pos="2160"/>
+        </w:tabs>
+        <w:ind w:left="2160" w:hanging="360"/>
+      </w:pPr>
+      <w:rPr>
+        <w:rFonts w:ascii="Wingdings" w:hAnsi="Wingdings" w:hint="default"/>
+        <w:sz w:val="20"/>
+      </w:rPr>
+    </w:lvl>
+    <w:lvl w:ilvl="3" w:tentative="1">
+      <w:start w:val="1"/>
+      <w:numFmt w:val="bullet"/>
+      <w:lvlText w:val=""/>
+      <w:lvlJc w:val="left"/>
+      <w:pPr>
+        <w:tabs>
+          <w:tab w:val="num" w:pos="2880"/>
+        </w:tabs>
+        <w:ind w:left="2880" w:hanging="360"/>
+      </w:pPr>
+      <w:rPr>
+        <w:rFonts w:ascii="Wingdings" w:hAnsi="Wingdings" w:hint="default"/>
+        <w:sz w:val="20"/>
+      </w:rPr>
+    </w:lvl>
+    <w:lvl w:ilvl="4" w:tentative="1">
+      <w:start w:val="1"/>
+      <w:numFmt w:val="bullet"/>
+      <w:lvlText w:val=""/>
+      <w:lvlJc w:val="left"/>
+      <w:pPr>
+        <w:tabs>
+          <w:tab w:val="num" w:pos="3600"/>
+        </w:tabs>
+        <w:ind w:left="3600" w:hanging="360"/>
+      </w:pPr>
+      <w:rPr>
+        <w:rFonts w:ascii="Wingdings" w:hAnsi="Wingdings" w:hint="default"/>
+        <w:sz w:val="20"/>
+      </w:rPr>
+    </w:lvl>
+    <w:lvl w:ilvl="5" w:tentative="1">
+      <w:start w:val="1"/>
+      <w:numFmt w:val="bullet"/>
+      <w:lvlText w:val=""/>
+      <w:lvlJc w:val="left"/>
+      <w:pPr>
+        <w:tabs>
+          <w:tab w:val="num" w:pos="4320"/>
+        </w:tabs>
+        <w:ind w:left="4320" w:hanging="360"/>
+      </w:pPr>
+      <w:rPr>
+        <w:rFonts w:ascii="Wingdings" w:hAnsi="Wingdings" w:hint="default"/>
+        <w:sz w:val="20"/>
+      </w:rPr>
+    </w:lvl>
+    <w:lvl w:ilvl="6" w:tentative="1">
+      <w:start w:val="1"/>
+      <w:numFmt w:val="bullet"/>
+      <w:lvlText w:val=""/>
+      <w:lvlJc w:val="left"/>
+      <w:pPr>
+        <w:tabs>
+          <w:tab w:val="num" w:pos="5040"/>
+        </w:tabs>
+        <w:ind w:left="5040" w:hanging="360"/>
+      </w:pPr>
+      <w:rPr>
+        <w:rFonts w:ascii="Wingdings" w:hAnsi="Wingdings" w:hint="default"/>
+        <w:sz w:val="20"/>
+      </w:rPr>
+    </w:lvl>
+    <w:lvl w:ilvl="7" w:tentative="1">
+      <w:start w:val="1"/>
+      <w:numFmt w:val="bullet"/>
+      <w:lvlText w:val=""/>
+      <w:lvlJc w:val="left"/>
+      <w:pPr>
+        <w:tabs>
+          <w:tab w:val="num" w:pos="5760"/>
+        </w:tabs>
+        <w:ind w:left="5760" w:hanging="360"/>
+      </w:pPr>
+      <w:rPr>
+        <w:rFonts w:ascii="Wingdings" w:hAnsi="Wingdings" w:hint="default"/>
+        <w:sz w:val="20"/>
+      </w:rPr>
+    </w:lvl>
+    <w:lvl w:ilvl="8" w:tentative="1">
+      <w:start w:val="1"/>
+      <w:numFmt w:val="bullet"/>
+      <w:lvlText w:val=""/>
+      <w:lvlJc w:val="left"/>
+      <w:pPr>
+        <w:tabs>
+          <w:tab w:val="num" w:pos="6480"/>
+        </w:tabs>
+        <w:ind w:left="6480" w:hanging="360"/>
+      </w:pPr>
+      <w:rPr>
+        <w:rFonts w:ascii="Wingdings" w:hAnsi="Wingdings" w:hint="default"/>
+        <w:sz w:val="20"/>
+      </w:rPr>
+    </w:lvl>
+  </w:abstractNum>
+  <w:abstractNum w:abstractNumId="15" w15:restartNumberingAfterBreak="0">
+    <w:nsid w:val="51880CD8"/>
+    <w:multiLevelType w:val="multilevel"/>
+    <w:tmpl w:val="BB7E6C9A"/>
+    <w:lvl w:ilvl="0">
+      <w:start w:val="1"/>
+      <w:numFmt w:val="bullet"/>
+      <w:lvlText w:val=""/>
+      <w:lvlJc w:val="left"/>
+      <w:pPr>
+        <w:tabs>
+          <w:tab w:val="num" w:pos="720"/>
+        </w:tabs>
+        <w:ind w:left="720" w:hanging="360"/>
+      </w:pPr>
+      <w:rPr>
+        <w:rFonts w:ascii="Symbol" w:hAnsi="Symbol" w:hint="default"/>
+        <w:sz w:val="20"/>
+      </w:rPr>
+    </w:lvl>
+    <w:lvl w:ilvl="1" w:tentative="1">
+      <w:start w:val="1"/>
+      <w:numFmt w:val="bullet"/>
+      <w:lvlText w:val="o"/>
+      <w:lvlJc w:val="left"/>
+      <w:pPr>
+        <w:tabs>
+          <w:tab w:val="num" w:pos="1440"/>
+        </w:tabs>
+        <w:ind w:left="1440" w:hanging="360"/>
+      </w:pPr>
+      <w:rPr>
+        <w:rFonts w:ascii="Courier New" w:hAnsi="Courier New" w:hint="default"/>
+        <w:sz w:val="20"/>
+      </w:rPr>
+    </w:lvl>
+    <w:lvl w:ilvl="2" w:tentative="1">
+      <w:start w:val="1"/>
+      <w:numFmt w:val="bullet"/>
+      <w:lvlText w:val=""/>
+      <w:lvlJc w:val="left"/>
+      <w:pPr>
+        <w:tabs>
+          <w:tab w:val="num" w:pos="2160"/>
+        </w:tabs>
+        <w:ind w:left="2160" w:hanging="360"/>
+      </w:pPr>
+      <w:rPr>
+        <w:rFonts w:ascii="Wingdings" w:hAnsi="Wingdings" w:hint="default"/>
+        <w:sz w:val="20"/>
+      </w:rPr>
+    </w:lvl>
+    <w:lvl w:ilvl="3" w:tentative="1">
+      <w:start w:val="1"/>
+      <w:numFmt w:val="bullet"/>
+      <w:lvlText w:val=""/>
+      <w:lvlJc w:val="left"/>
+      <w:pPr>
+        <w:tabs>
+          <w:tab w:val="num" w:pos="2880"/>
+        </w:tabs>
+        <w:ind w:left="2880" w:hanging="360"/>
+      </w:pPr>
+      <w:rPr>
+        <w:rFonts w:ascii="Wingdings" w:hAnsi="Wingdings" w:hint="default"/>
+        <w:sz w:val="20"/>
+      </w:rPr>
+    </w:lvl>
+    <w:lvl w:ilvl="4" w:tentative="1">
+      <w:start w:val="1"/>
+      <w:numFmt w:val="bullet"/>
+      <w:lvlText w:val=""/>
+      <w:lvlJc w:val="left"/>
+      <w:pPr>
+        <w:tabs>
+          <w:tab w:val="num" w:pos="3600"/>
+        </w:tabs>
+        <w:ind w:left="3600" w:hanging="360"/>
+      </w:pPr>
+      <w:rPr>
+        <w:rFonts w:ascii="Wingdings" w:hAnsi="Wingdings" w:hint="default"/>
+        <w:sz w:val="20"/>
+      </w:rPr>
+    </w:lvl>
+    <w:lvl w:ilvl="5" w:tentative="1">
+      <w:start w:val="1"/>
+      <w:numFmt w:val="bullet"/>
+      <w:lvlText w:val=""/>
+      <w:lvlJc w:val="left"/>
+      <w:pPr>
+        <w:tabs>
+          <w:tab w:val="num" w:pos="4320"/>
+        </w:tabs>
+        <w:ind w:left="4320" w:hanging="360"/>
+      </w:pPr>
+      <w:rPr>
+        <w:rFonts w:ascii="Wingdings" w:hAnsi="Wingdings" w:hint="default"/>
+        <w:sz w:val="20"/>
+      </w:rPr>
+    </w:lvl>
+    <w:lvl w:ilvl="6" w:tentative="1">
+      <w:start w:val="1"/>
+      <w:numFmt w:val="bullet"/>
+      <w:lvlText w:val=""/>
+      <w:lvlJc w:val="left"/>
+      <w:pPr>
+        <w:tabs>
+          <w:tab w:val="num" w:pos="5040"/>
+        </w:tabs>
+        <w:ind w:left="5040" w:hanging="360"/>
+      </w:pPr>
+      <w:rPr>
+        <w:rFonts w:ascii="Wingdings" w:hAnsi="Wingdings" w:hint="default"/>
+        <w:sz w:val="20"/>
+      </w:rPr>
+    </w:lvl>
+    <w:lvl w:ilvl="7" w:tentative="1">
+      <w:start w:val="1"/>
+      <w:numFmt w:val="bullet"/>
+      <w:lvlText w:val=""/>
+      <w:lvlJc w:val="left"/>
+      <w:pPr>
+        <w:tabs>
+          <w:tab w:val="num" w:pos="5760"/>
+        </w:tabs>
+        <w:ind w:left="5760" w:hanging="360"/>
+      </w:pPr>
+      <w:rPr>
+        <w:rFonts w:ascii="Wingdings" w:hAnsi="Wingdings" w:hint="default"/>
+        <w:sz w:val="20"/>
+      </w:rPr>
+    </w:lvl>
+    <w:lvl w:ilvl="8" w:tentative="1">
+      <w:start w:val="1"/>
+      <w:numFmt w:val="bullet"/>
+      <w:lvlText w:val=""/>
+      <w:lvlJc w:val="left"/>
+      <w:pPr>
+        <w:tabs>
+          <w:tab w:val="num" w:pos="6480"/>
+        </w:tabs>
+        <w:ind w:left="6480" w:hanging="360"/>
+      </w:pPr>
+      <w:rPr>
+        <w:rFonts w:ascii="Wingdings" w:hAnsi="Wingdings" w:hint="default"/>
+        <w:sz w:val="20"/>
+      </w:rPr>
+    </w:lvl>
+  </w:abstractNum>
+  <w:abstractNum w:abstractNumId="16" w15:restartNumberingAfterBreak="0">
+    <w:nsid w:val="53E00C77"/>
+    <w:multiLevelType w:val="multilevel"/>
+    <w:tmpl w:val="C6E4ABE8"/>
+    <w:lvl w:ilvl="0">
+      <w:start w:val="1"/>
+      <w:numFmt w:val="bullet"/>
+      <w:lvlText w:val=""/>
+      <w:lvlJc w:val="left"/>
+      <w:pPr>
+        <w:tabs>
+          <w:tab w:val="num" w:pos="720"/>
+        </w:tabs>
+        <w:ind w:left="720" w:hanging="360"/>
+      </w:pPr>
+      <w:rPr>
+        <w:rFonts w:ascii="Symbol" w:hAnsi="Symbol" w:hint="default"/>
+        <w:sz w:val="20"/>
+      </w:rPr>
+    </w:lvl>
+    <w:lvl w:ilvl="1" w:tentative="1">
+      <w:start w:val="1"/>
+      <w:numFmt w:val="bullet"/>
+      <w:lvlText w:val="o"/>
+      <w:lvlJc w:val="left"/>
+      <w:pPr>
+        <w:tabs>
+          <w:tab w:val="num" w:pos="1440"/>
+        </w:tabs>
+        <w:ind w:left="1440" w:hanging="360"/>
+      </w:pPr>
+      <w:rPr>
+        <w:rFonts w:ascii="Courier New" w:hAnsi="Courier New" w:hint="default"/>
+        <w:sz w:val="20"/>
+      </w:rPr>
+    </w:lvl>
+    <w:lvl w:ilvl="2" w:tentative="1">
+      <w:start w:val="1"/>
+      <w:numFmt w:val="bullet"/>
+      <w:lvlText w:val=""/>
+      <w:lvlJc w:val="left"/>
+      <w:pPr>
+        <w:tabs>
+          <w:tab w:val="num" w:pos="2160"/>
+        </w:tabs>
+        <w:ind w:left="2160" w:hanging="360"/>
+      </w:pPr>
+      <w:rPr>
+        <w:rFonts w:ascii="Wingdings" w:hAnsi="Wingdings" w:hint="default"/>
+        <w:sz w:val="20"/>
+      </w:rPr>
+    </w:lvl>
+    <w:lvl w:ilvl="3" w:tentative="1">
+      <w:start w:val="1"/>
+      <w:numFmt w:val="bullet"/>
+      <w:lvlText w:val=""/>
+      <w:lvlJc w:val="left"/>
+      <w:pPr>
+        <w:tabs>
+          <w:tab w:val="num" w:pos="2880"/>
+        </w:tabs>
+        <w:ind w:left="2880" w:hanging="360"/>
+      </w:pPr>
+      <w:rPr>
+        <w:rFonts w:ascii="Wingdings" w:hAnsi="Wingdings" w:hint="default"/>
+        <w:sz w:val="20"/>
+      </w:rPr>
+    </w:lvl>
+    <w:lvl w:ilvl="4" w:tentative="1">
+      <w:start w:val="1"/>
+      <w:numFmt w:val="bullet"/>
+      <w:lvlText w:val=""/>
+      <w:lvlJc w:val="left"/>
+      <w:pPr>
+        <w:tabs>
+          <w:tab w:val="num" w:pos="3600"/>
+        </w:tabs>
+        <w:ind w:left="3600" w:hanging="360"/>
+      </w:pPr>
+      <w:rPr>
+        <w:rFonts w:ascii="Wingdings" w:hAnsi="Wingdings" w:hint="default"/>
+        <w:sz w:val="20"/>
+      </w:rPr>
+    </w:lvl>
+    <w:lvl w:ilvl="5" w:tentative="1">
+      <w:start w:val="1"/>
+      <w:numFmt w:val="bullet"/>
+      <w:lvlText w:val=""/>
+      <w:lvlJc w:val="left"/>
+      <w:pPr>
+        <w:tabs>
+          <w:tab w:val="num" w:pos="4320"/>
+        </w:tabs>
+        <w:ind w:left="4320" w:hanging="360"/>
+      </w:pPr>
+      <w:rPr>
+        <w:rFonts w:ascii="Wingdings" w:hAnsi="Wingdings" w:hint="default"/>
+        <w:sz w:val="20"/>
+      </w:rPr>
+    </w:lvl>
+    <w:lvl w:ilvl="6" w:tentative="1">
+      <w:start w:val="1"/>
+      <w:numFmt w:val="bullet"/>
+      <w:lvlText w:val=""/>
+      <w:lvlJc w:val="left"/>
+      <w:pPr>
+        <w:tabs>
+          <w:tab w:val="num" w:pos="5040"/>
+        </w:tabs>
+        <w:ind w:left="5040" w:hanging="360"/>
+      </w:pPr>
+      <w:rPr>
+        <w:rFonts w:ascii="Wingdings" w:hAnsi="Wingdings" w:hint="default"/>
+        <w:sz w:val="20"/>
+      </w:rPr>
+    </w:lvl>
+    <w:lvl w:ilvl="7" w:tentative="1">
+      <w:start w:val="1"/>
+      <w:numFmt w:val="bullet"/>
+      <w:lvlText w:val=""/>
+      <w:lvlJc w:val="left"/>
+      <w:pPr>
+        <w:tabs>
+          <w:tab w:val="num" w:pos="5760"/>
+        </w:tabs>
+        <w:ind w:left="5760" w:hanging="360"/>
+      </w:pPr>
+      <w:rPr>
+        <w:rFonts w:ascii="Wingdings" w:hAnsi="Wingdings" w:hint="default"/>
+        <w:sz w:val="20"/>
+      </w:rPr>
+    </w:lvl>
+    <w:lvl w:ilvl="8" w:tentative="1">
+      <w:start w:val="1"/>
+      <w:numFmt w:val="bullet"/>
+      <w:lvlText w:val=""/>
+      <w:lvlJc w:val="left"/>
+      <w:pPr>
+        <w:tabs>
+          <w:tab w:val="num" w:pos="6480"/>
+        </w:tabs>
+        <w:ind w:left="6480" w:hanging="360"/>
+      </w:pPr>
+      <w:rPr>
+        <w:rFonts w:ascii="Wingdings" w:hAnsi="Wingdings" w:hint="default"/>
+        <w:sz w:val="20"/>
+      </w:rPr>
+    </w:lvl>
+  </w:abstractNum>
+  <w:abstractNum w:abstractNumId="17" w15:restartNumberingAfterBreak="0">
+    <w:nsid w:val="55D801C3"/>
+    <w:multiLevelType w:val="multilevel"/>
+    <w:tmpl w:val="A716931C"/>
+    <w:lvl w:ilvl="0">
+      <w:start w:val="1"/>
+      <w:numFmt w:val="bullet"/>
+      <w:lvlText w:val=""/>
+      <w:lvlJc w:val="left"/>
+      <w:pPr>
+        <w:tabs>
+          <w:tab w:val="num" w:pos="720"/>
+        </w:tabs>
+        <w:ind w:left="720" w:hanging="360"/>
+      </w:pPr>
+      <w:rPr>
+        <w:rFonts w:ascii="Symbol" w:hAnsi="Symbol" w:hint="default"/>
+        <w:sz w:val="20"/>
+      </w:rPr>
+    </w:lvl>
+    <w:lvl w:ilvl="1" w:tentative="1">
+      <w:start w:val="1"/>
+      <w:numFmt w:val="bullet"/>
+      <w:lvlText w:val="o"/>
+      <w:lvlJc w:val="left"/>
+      <w:pPr>
+        <w:tabs>
+          <w:tab w:val="num" w:pos="1440"/>
+        </w:tabs>
+        <w:ind w:left="1440" w:hanging="360"/>
+      </w:pPr>
+      <w:rPr>
+        <w:rFonts w:ascii="Courier New" w:hAnsi="Courier New" w:hint="default"/>
+        <w:sz w:val="20"/>
+      </w:rPr>
+    </w:lvl>
+    <w:lvl w:ilvl="2" w:tentative="1">
+      <w:start w:val="1"/>
+      <w:numFmt w:val="bullet"/>
+      <w:lvlText w:val=""/>
+      <w:lvlJc w:val="left"/>
+      <w:pPr>
+        <w:tabs>
+          <w:tab w:val="num" w:pos="2160"/>
+        </w:tabs>
+        <w:ind w:left="2160" w:hanging="360"/>
+      </w:pPr>
+      <w:rPr>
+        <w:rFonts w:ascii="Wingdings" w:hAnsi="Wingdings" w:hint="default"/>
+        <w:sz w:val="20"/>
+      </w:rPr>
+    </w:lvl>
+    <w:lvl w:ilvl="3" w:tentative="1">
+      <w:start w:val="1"/>
+      <w:numFmt w:val="bullet"/>
+      <w:lvlText w:val=""/>
+      <w:lvlJc w:val="left"/>
+      <w:pPr>
+        <w:tabs>
+          <w:tab w:val="num" w:pos="2880"/>
+        </w:tabs>
+        <w:ind w:left="2880" w:hanging="360"/>
+      </w:pPr>
+      <w:rPr>
+        <w:rFonts w:ascii="Wingdings" w:hAnsi="Wingdings" w:hint="default"/>
+        <w:sz w:val="20"/>
+      </w:rPr>
+    </w:lvl>
+    <w:lvl w:ilvl="4" w:tentative="1">
+      <w:start w:val="1"/>
+      <w:numFmt w:val="bullet"/>
+      <w:lvlText w:val=""/>
+      <w:lvlJc w:val="left"/>
+      <w:pPr>
+        <w:tabs>
+          <w:tab w:val="num" w:pos="3600"/>
+        </w:tabs>
+        <w:ind w:left="3600" w:hanging="360"/>
+      </w:pPr>
+      <w:rPr>
+        <w:rFonts w:ascii="Wingdings" w:hAnsi="Wingdings" w:hint="default"/>
+        <w:sz w:val="20"/>
+      </w:rPr>
+    </w:lvl>
+    <w:lvl w:ilvl="5" w:tentative="1">
+      <w:start w:val="1"/>
+      <w:numFmt w:val="bullet"/>
+      <w:lvlText w:val=""/>
+      <w:lvlJc w:val="left"/>
+      <w:pPr>
+        <w:tabs>
+          <w:tab w:val="num" w:pos="4320"/>
+        </w:tabs>
+        <w:ind w:left="4320" w:hanging="360"/>
+      </w:pPr>
+      <w:rPr>
+        <w:rFonts w:ascii="Wingdings" w:hAnsi="Wingdings" w:hint="default"/>
+        <w:sz w:val="20"/>
+      </w:rPr>
+    </w:lvl>
+    <w:lvl w:ilvl="6" w:tentative="1">
+      <w:start w:val="1"/>
+      <w:numFmt w:val="bullet"/>
+      <w:lvlText w:val=""/>
+      <w:lvlJc w:val="left"/>
+      <w:pPr>
+        <w:tabs>
+          <w:tab w:val="num" w:pos="5040"/>
+        </w:tabs>
+        <w:ind w:left="5040" w:hanging="360"/>
+      </w:pPr>
+      <w:rPr>
+        <w:rFonts w:ascii="Wingdings" w:hAnsi="Wingdings" w:hint="default"/>
+        <w:sz w:val="20"/>
+      </w:rPr>
+    </w:lvl>
+    <w:lvl w:ilvl="7" w:tentative="1">
+      <w:start w:val="1"/>
+      <w:numFmt w:val="bullet"/>
+      <w:lvlText w:val=""/>
+      <w:lvlJc w:val="left"/>
+      <w:pPr>
+        <w:tabs>
+          <w:tab w:val="num" w:pos="5760"/>
+        </w:tabs>
+        <w:ind w:left="5760" w:hanging="360"/>
+      </w:pPr>
+      <w:rPr>
+        <w:rFonts w:ascii="Wingdings" w:hAnsi="Wingdings" w:hint="default"/>
+        <w:sz w:val="20"/>
+      </w:rPr>
+    </w:lvl>
+    <w:lvl w:ilvl="8" w:tentative="1">
+      <w:start w:val="1"/>
+      <w:numFmt w:val="bullet"/>
+      <w:lvlText w:val=""/>
+      <w:lvlJc w:val="left"/>
+      <w:pPr>
+        <w:tabs>
+          <w:tab w:val="num" w:pos="6480"/>
+        </w:tabs>
+        <w:ind w:left="6480" w:hanging="360"/>
+      </w:pPr>
+      <w:rPr>
+        <w:rFonts w:ascii="Wingdings" w:hAnsi="Wingdings" w:hint="default"/>
+        <w:sz w:val="20"/>
+      </w:rPr>
+    </w:lvl>
+  </w:abstractNum>
+  <w:abstractNum w:abstractNumId="18" w15:restartNumberingAfterBreak="0">
     <w:nsid w:val="58810DFD"/>
     <w:multiLevelType w:val="multilevel"/>
     <w:tmpl w:val="CF02F672"/>
@@ -2091,7 +6049,7 @@
       </w:rPr>
     </w:lvl>
   </w:abstractNum>
-  <w:abstractNum w:abstractNumId="4" w15:restartNumberingAfterBreak="0">
+  <w:abstractNum w:abstractNumId="19" w15:restartNumberingAfterBreak="0">
     <w:nsid w:val="5A3C674A"/>
     <w:multiLevelType w:val="multilevel"/>
     <w:tmpl w:val="9AB4881A"/>
@@ -2240,20 +6198,369 @@
       </w:rPr>
     </w:lvl>
   </w:abstractNum>
+  <w:abstractNum w:abstractNumId="20" w15:restartNumberingAfterBreak="0">
+    <w:nsid w:val="6D4B3720"/>
+    <w:multiLevelType w:val="multilevel"/>
+    <w:tmpl w:val="F69C46B0"/>
+    <w:lvl w:ilvl="0">
+      <w:start w:val="1"/>
+      <w:numFmt w:val="bullet"/>
+      <w:lvlText w:val=""/>
+      <w:lvlJc w:val="left"/>
+      <w:pPr>
+        <w:tabs>
+          <w:tab w:val="num" w:pos="720"/>
+        </w:tabs>
+        <w:ind w:left="720" w:hanging="360"/>
+      </w:pPr>
+      <w:rPr>
+        <w:rFonts w:ascii="Symbol" w:hAnsi="Symbol" w:hint="default"/>
+        <w:sz w:val="20"/>
+      </w:rPr>
+    </w:lvl>
+    <w:lvl w:ilvl="1" w:tentative="1">
+      <w:start w:val="1"/>
+      <w:numFmt w:val="bullet"/>
+      <w:lvlText w:val="o"/>
+      <w:lvlJc w:val="left"/>
+      <w:pPr>
+        <w:tabs>
+          <w:tab w:val="num" w:pos="1440"/>
+        </w:tabs>
+        <w:ind w:left="1440" w:hanging="360"/>
+      </w:pPr>
+      <w:rPr>
+        <w:rFonts w:ascii="Courier New" w:hAnsi="Courier New" w:hint="default"/>
+        <w:sz w:val="20"/>
+      </w:rPr>
+    </w:lvl>
+    <w:lvl w:ilvl="2" w:tentative="1">
+      <w:start w:val="1"/>
+      <w:numFmt w:val="bullet"/>
+      <w:lvlText w:val=""/>
+      <w:lvlJc w:val="left"/>
+      <w:pPr>
+        <w:tabs>
+          <w:tab w:val="num" w:pos="2160"/>
+        </w:tabs>
+        <w:ind w:left="2160" w:hanging="360"/>
+      </w:pPr>
+      <w:rPr>
+        <w:rFonts w:ascii="Wingdings" w:hAnsi="Wingdings" w:hint="default"/>
+        <w:sz w:val="20"/>
+      </w:rPr>
+    </w:lvl>
+    <w:lvl w:ilvl="3" w:tentative="1">
+      <w:start w:val="1"/>
+      <w:numFmt w:val="bullet"/>
+      <w:lvlText w:val=""/>
+      <w:lvlJc w:val="left"/>
+      <w:pPr>
+        <w:tabs>
+          <w:tab w:val="num" w:pos="2880"/>
+        </w:tabs>
+        <w:ind w:left="2880" w:hanging="360"/>
+      </w:pPr>
+      <w:rPr>
+        <w:rFonts w:ascii="Wingdings" w:hAnsi="Wingdings" w:hint="default"/>
+        <w:sz w:val="20"/>
+      </w:rPr>
+    </w:lvl>
+    <w:lvl w:ilvl="4" w:tentative="1">
+      <w:start w:val="1"/>
+      <w:numFmt w:val="bullet"/>
+      <w:lvlText w:val=""/>
+      <w:lvlJc w:val="left"/>
+      <w:pPr>
+        <w:tabs>
+          <w:tab w:val="num" w:pos="3600"/>
+        </w:tabs>
+        <w:ind w:left="3600" w:hanging="360"/>
+      </w:pPr>
+      <w:rPr>
+        <w:rFonts w:ascii="Wingdings" w:hAnsi="Wingdings" w:hint="default"/>
+        <w:sz w:val="20"/>
+      </w:rPr>
+    </w:lvl>
+    <w:lvl w:ilvl="5" w:tentative="1">
+      <w:start w:val="1"/>
+      <w:numFmt w:val="bullet"/>
+      <w:lvlText w:val=""/>
+      <w:lvlJc w:val="left"/>
+      <w:pPr>
+        <w:tabs>
+          <w:tab w:val="num" w:pos="4320"/>
+        </w:tabs>
+        <w:ind w:left="4320" w:hanging="360"/>
+      </w:pPr>
+      <w:rPr>
+        <w:rFonts w:ascii="Wingdings" w:hAnsi="Wingdings" w:hint="default"/>
+        <w:sz w:val="20"/>
+      </w:rPr>
+    </w:lvl>
+    <w:lvl w:ilvl="6" w:tentative="1">
+      <w:start w:val="1"/>
+      <w:numFmt w:val="bullet"/>
+      <w:lvlText w:val=""/>
+      <w:lvlJc w:val="left"/>
+      <w:pPr>
+        <w:tabs>
+          <w:tab w:val="num" w:pos="5040"/>
+        </w:tabs>
+        <w:ind w:left="5040" w:hanging="360"/>
+      </w:pPr>
+      <w:rPr>
+        <w:rFonts w:ascii="Wingdings" w:hAnsi="Wingdings" w:hint="default"/>
+        <w:sz w:val="20"/>
+      </w:rPr>
+    </w:lvl>
+    <w:lvl w:ilvl="7" w:tentative="1">
+      <w:start w:val="1"/>
+      <w:numFmt w:val="bullet"/>
+      <w:lvlText w:val=""/>
+      <w:lvlJc w:val="left"/>
+      <w:pPr>
+        <w:tabs>
+          <w:tab w:val="num" w:pos="5760"/>
+        </w:tabs>
+        <w:ind w:left="5760" w:hanging="360"/>
+      </w:pPr>
+      <w:rPr>
+        <w:rFonts w:ascii="Wingdings" w:hAnsi="Wingdings" w:hint="default"/>
+        <w:sz w:val="20"/>
+      </w:rPr>
+    </w:lvl>
+    <w:lvl w:ilvl="8" w:tentative="1">
+      <w:start w:val="1"/>
+      <w:numFmt w:val="bullet"/>
+      <w:lvlText w:val=""/>
+      <w:lvlJc w:val="left"/>
+      <w:pPr>
+        <w:tabs>
+          <w:tab w:val="num" w:pos="6480"/>
+        </w:tabs>
+        <w:ind w:left="6480" w:hanging="360"/>
+      </w:pPr>
+      <w:rPr>
+        <w:rFonts w:ascii="Wingdings" w:hAnsi="Wingdings" w:hint="default"/>
+        <w:sz w:val="20"/>
+      </w:rPr>
+    </w:lvl>
+  </w:abstractNum>
+  <w:abstractNum w:abstractNumId="21" w15:restartNumberingAfterBreak="0">
+    <w:nsid w:val="7AD46794"/>
+    <w:multiLevelType w:val="multilevel"/>
+    <w:tmpl w:val="B97E9898"/>
+    <w:lvl w:ilvl="0">
+      <w:start w:val="1"/>
+      <w:numFmt w:val="bullet"/>
+      <w:lvlText w:val=""/>
+      <w:lvlJc w:val="left"/>
+      <w:pPr>
+        <w:tabs>
+          <w:tab w:val="num" w:pos="720"/>
+        </w:tabs>
+        <w:ind w:left="720" w:hanging="360"/>
+      </w:pPr>
+      <w:rPr>
+        <w:rFonts w:ascii="Symbol" w:hAnsi="Symbol" w:hint="default"/>
+        <w:sz w:val="20"/>
+      </w:rPr>
+    </w:lvl>
+    <w:lvl w:ilvl="1">
+      <w:start w:val="1"/>
+      <w:numFmt w:val="bullet"/>
+      <w:lvlText w:val="o"/>
+      <w:lvlJc w:val="left"/>
+      <w:pPr>
+        <w:tabs>
+          <w:tab w:val="num" w:pos="1440"/>
+        </w:tabs>
+        <w:ind w:left="1440" w:hanging="360"/>
+      </w:pPr>
+      <w:rPr>
+        <w:rFonts w:ascii="Courier New" w:hAnsi="Courier New" w:hint="default"/>
+        <w:sz w:val="20"/>
+      </w:rPr>
+    </w:lvl>
+    <w:lvl w:ilvl="2" w:tentative="1">
+      <w:start w:val="1"/>
+      <w:numFmt w:val="bullet"/>
+      <w:lvlText w:val=""/>
+      <w:lvlJc w:val="left"/>
+      <w:pPr>
+        <w:tabs>
+          <w:tab w:val="num" w:pos="2160"/>
+        </w:tabs>
+        <w:ind w:left="2160" w:hanging="360"/>
+      </w:pPr>
+      <w:rPr>
+        <w:rFonts w:ascii="Wingdings" w:hAnsi="Wingdings" w:hint="default"/>
+        <w:sz w:val="20"/>
+      </w:rPr>
+    </w:lvl>
+    <w:lvl w:ilvl="3" w:tentative="1">
+      <w:start w:val="1"/>
+      <w:numFmt w:val="bullet"/>
+      <w:lvlText w:val=""/>
+      <w:lvlJc w:val="left"/>
+      <w:pPr>
+        <w:tabs>
+          <w:tab w:val="num" w:pos="2880"/>
+        </w:tabs>
+        <w:ind w:left="2880" w:hanging="360"/>
+      </w:pPr>
+      <w:rPr>
+        <w:rFonts w:ascii="Wingdings" w:hAnsi="Wingdings" w:hint="default"/>
+        <w:sz w:val="20"/>
+      </w:rPr>
+    </w:lvl>
+    <w:lvl w:ilvl="4" w:tentative="1">
+      <w:start w:val="1"/>
+      <w:numFmt w:val="bullet"/>
+      <w:lvlText w:val=""/>
+      <w:lvlJc w:val="left"/>
+      <w:pPr>
+        <w:tabs>
+          <w:tab w:val="num" w:pos="3600"/>
+        </w:tabs>
+        <w:ind w:left="3600" w:hanging="360"/>
+      </w:pPr>
+      <w:rPr>
+        <w:rFonts w:ascii="Wingdings" w:hAnsi="Wingdings" w:hint="default"/>
+        <w:sz w:val="20"/>
+      </w:rPr>
+    </w:lvl>
+    <w:lvl w:ilvl="5" w:tentative="1">
+      <w:start w:val="1"/>
+      <w:numFmt w:val="bullet"/>
+      <w:lvlText w:val=""/>
+      <w:lvlJc w:val="left"/>
+      <w:pPr>
+        <w:tabs>
+          <w:tab w:val="num" w:pos="4320"/>
+        </w:tabs>
+        <w:ind w:left="4320" w:hanging="360"/>
+      </w:pPr>
+      <w:rPr>
+        <w:rFonts w:ascii="Wingdings" w:hAnsi="Wingdings" w:hint="default"/>
+        <w:sz w:val="20"/>
+      </w:rPr>
+    </w:lvl>
+    <w:lvl w:ilvl="6" w:tentative="1">
+      <w:start w:val="1"/>
+      <w:numFmt w:val="bullet"/>
+      <w:lvlText w:val=""/>
+      <w:lvlJc w:val="left"/>
+      <w:pPr>
+        <w:tabs>
+          <w:tab w:val="num" w:pos="5040"/>
+        </w:tabs>
+        <w:ind w:left="5040" w:hanging="360"/>
+      </w:pPr>
+      <w:rPr>
+        <w:rFonts w:ascii="Wingdings" w:hAnsi="Wingdings" w:hint="default"/>
+        <w:sz w:val="20"/>
+      </w:rPr>
+    </w:lvl>
+    <w:lvl w:ilvl="7" w:tentative="1">
+      <w:start w:val="1"/>
+      <w:numFmt w:val="bullet"/>
+      <w:lvlText w:val=""/>
+      <w:lvlJc w:val="left"/>
+      <w:pPr>
+        <w:tabs>
+          <w:tab w:val="num" w:pos="5760"/>
+        </w:tabs>
+        <w:ind w:left="5760" w:hanging="360"/>
+      </w:pPr>
+      <w:rPr>
+        <w:rFonts w:ascii="Wingdings" w:hAnsi="Wingdings" w:hint="default"/>
+        <w:sz w:val="20"/>
+      </w:rPr>
+    </w:lvl>
+    <w:lvl w:ilvl="8" w:tentative="1">
+      <w:start w:val="1"/>
+      <w:numFmt w:val="bullet"/>
+      <w:lvlText w:val=""/>
+      <w:lvlJc w:val="left"/>
+      <w:pPr>
+        <w:tabs>
+          <w:tab w:val="num" w:pos="6480"/>
+        </w:tabs>
+        <w:ind w:left="6480" w:hanging="360"/>
+      </w:pPr>
+      <w:rPr>
+        <w:rFonts w:ascii="Wingdings" w:hAnsi="Wingdings" w:hint="default"/>
+        <w:sz w:val="20"/>
+      </w:rPr>
+    </w:lvl>
+  </w:abstractNum>
   <w:num w:numId="1">
+    <w:abstractNumId w:val="11"/>
+  </w:num>
+  <w:num w:numId="2">
+    <w:abstractNumId w:val="19"/>
+  </w:num>
+  <w:num w:numId="3">
+    <w:abstractNumId w:val="18"/>
+  </w:num>
+  <w:num w:numId="4">
+    <w:abstractNumId w:val="5"/>
+  </w:num>
+  <w:num w:numId="5">
     <w:abstractNumId w:val="2"/>
   </w:num>
-  <w:num w:numId="2">
+  <w:num w:numId="6">
+    <w:abstractNumId w:val="3"/>
+  </w:num>
+  <w:num w:numId="7">
+    <w:abstractNumId w:val="13"/>
+  </w:num>
+  <w:num w:numId="8">
+    <w:abstractNumId w:val="10"/>
+  </w:num>
+  <w:num w:numId="9">
+    <w:abstractNumId w:val="7"/>
+  </w:num>
+  <w:num w:numId="10">
+    <w:abstractNumId w:val="14"/>
+  </w:num>
+  <w:num w:numId="11">
+    <w:abstractNumId w:val="12"/>
+  </w:num>
+  <w:num w:numId="12">
+    <w:abstractNumId w:val="20"/>
+  </w:num>
+  <w:num w:numId="13">
     <w:abstractNumId w:val="4"/>
   </w:num>
-  <w:num w:numId="3">
-    <w:abstractNumId w:val="3"/>
+  <w:num w:numId="14">
+    <w:abstractNumId w:val="17"/>
   </w:num>
-  <w:num w:numId="4">
+  <w:num w:numId="15">
     <w:abstractNumId w:val="1"/>
   </w:num>
-  <w:num w:numId="5">
+  <w:num w:numId="16">
     <w:abstractNumId w:val="0"/>
+  </w:num>
+  <w:num w:numId="17">
+    <w:abstractNumId w:val="6"/>
+  </w:num>
+  <w:num w:numId="18">
+    <w:abstractNumId w:val="8"/>
+  </w:num>
+  <w:num w:numId="19">
+    <w:abstractNumId w:val="16"/>
+  </w:num>
+  <w:num w:numId="20">
+    <w:abstractNumId w:val="9"/>
+  </w:num>
+  <w:num w:numId="21">
+    <w:abstractNumId w:val="21"/>
+  </w:num>
+  <w:num w:numId="22">
+    <w:abstractNumId w:val="15"/>
   </w:num>
   <w:numIdMacAtCleanup w:val="5"/>
 </w:numbering>

</xml_diff>